<commit_message>
Relecture complète du résumé de La Nuit
Seconde passe chapitre par chapitre : ajout des événements et détails
manquants, ordre des épisodes corrigé, remplissage et détails incertains
retirés ; dossier d'analyse vérifié et resserré.

Co-Authored-By: Claude Opus 5.5 <noreply@anthropic.com>
Claude-Session: https://claude.ai/code/session_01GoMc8BvgZymF35cjYRWC29
</commit_message>
<xml_diff>
--- a/La_Nuit_Elie_Wiesel_resume_et_analyse.docx
+++ b/La_Nuit_Elie_Wiesel_resume_et_analyse.docx
@@ -306,17 +306,17 @@
         <w:jc w:val="both"/>
       </w:pPr>
       <w:r>
-        <w:t xml:space="preserve">Le récit s'ouvre en 1941 à Sighet, petite ville de Transylvanie alors rattachée à la Hongrie. Eliezer, le narrateur, a douze ans. Il vit avec ses parents et ses trois sœurs, Hilda, Béa et la petite Tzipora, dans une famille juive pratiquante qui tient un magasin ; son père, commerçant respecté de la communauté, se consacre davantage aux affaires des autres qu'à celles de sa propre famille. Le garçon est d'une piété ardente : il étudie le Talmud le jour et, le soir, court à la synagogue pleurer sur la destruction du Temple. Il voudrait aussi s'initier à la Kabbale, la mystique juive, mais son père l'en juge trop jeune et affirme qu'il n'existe aucun kabbaliste à Sighet.</w:t>
-      </w:r>
-    </w:p>
-    <w:p>
-      <w:pPr>
-        <w:spacing w:after="120"/>
-        <w:ind w:firstLine="340"/>
-        <w:jc w:val="both"/>
-      </w:pPr>
-      <w:r>
-        <w:t xml:space="preserve">Eliezer se trouve pourtant un maître en la personne de Moshé le Bedeau, l'homme à tout faire de la maison de prière hassidique. Pauvre, effacé, maladroit, presque invisible, Moshé est aimé de tous parce qu'il ne dérange personne. Il remarque un soir le garçon en prière et engage avec lui une longue conversation sur le sens de la foi. Pour Moshé, l'homme se rapproche de Dieu par les questions qu'il Lui adresse, et les vraies réponses ne se trouvent qu'au fond de soi. Ensemble, ils lisent et relisent les mêmes pages du </w:t>
+        <w:t xml:space="preserve">Le récit s'ouvre à Sighet, petite ville de Transylvanie alors hongroise, en 1941. Eliezer, le narrateur, a douze ans et une foi ardente : le jour, il étudie le Talmud ; le soir, il court à la synagogue pleurer sur la destruction du Temple. Il est le troisième des quatre enfants et le seul fils, entre ses sœurs aînées Hilda et Béa et la petite Tzipora. Ses parents tiennent un magasin ; son père, très respecté, s'occupe davantage des affaires de la communauté que de sa propre famille. Il refuse à Eliezer un maître de Kabbale, la mystique juive : il est trop jeune, et il n'y a pas de kabbaliste à Sighet.</w:t>
+      </w:r>
+    </w:p>
+    <w:p>
+      <w:pPr>
+        <w:spacing w:after="120"/>
+        <w:ind w:firstLine="340"/>
+        <w:jc w:val="both"/>
+      </w:pPr>
+      <w:r>
+        <w:t xml:space="preserve">Eliezer trouve pourtant un maître : Moshé le Bedeau, l'homme à tout faire de la petite maison de prière hassidique, un pauvre effacé que tout le monde aime. Un soir, Moshé lui demande pourquoi il pleure en priant. Leurs conversations commencent alors : pour Moshé, l'homme s'élève vers Dieu par les questions qu'il Lui pose, et les vraies réponses ne se trouvent qu'en soi. Chaque soir, après le départ des fidèles, ils lisent ensemble le </w:t>
       </w:r>
       <w:r>
         <w:rPr>
@@ -326,7 +326,7 @@
         <w:t xml:space="preserve">Zohar</w:t>
       </w:r>
       <w:r>
-        <w:t xml:space="preserve">, dans la pénombre de la synagogue : l'enfant découvre une foi faite d'interrogations plutôt que de certitudes, ce qui donne un sens tragique à tout ce qui suivra.</w:t>
+        <w:t xml:space="preserve">, non pour l'apprendre par cœur, mais pour en saisir l'essence.</w:t>
       </w:r>
     </w:p>
     <w:p>
@@ -344,55 +344,73 @@
         <w:jc w:val="both"/>
       </w:pPr>
       <w:r>
-        <w:t xml:space="preserve">Un jour, les autorités hongroises expulsent de Sighet les Juifs étrangers. Moshé, qui en fait partie, est entassé avec eux dans des trains. Les habitants pleurent un moment, puis oublient vite ; on se rassure en se disant qu'ils travaillent sans doute quelque part en Galicie. Plusieurs mois plus tard, Moshé reparaît. Il raconte qu'une fois passée la frontière polonaise, les déportés ont été livrés à la Gestapo, conduits dans une forêt et contraints de creuser de grandes fosses avant d'être abattus un à un ; des nourrissons servaient de cibles aux mitraillettes. Blessé à la jambe et laissé pour mort, il a pu s'enfuir. Il va de maison en maison répéter son histoire, mais personne ne le croit : on le prend pour un fou, on le soupçonne de chercher la pitié. Moshé n'a plus de larmes ni de prières ; il ne demande qu'à être entendu, pour sauver ceux qui peuvent encore l'être.</w:t>
-      </w:r>
-    </w:p>
-    <w:p>
-      <w:pPr>
-        <w:spacing w:after="120"/>
-        <w:ind w:firstLine="340"/>
-        <w:jc w:val="both"/>
-      </w:pPr>
-      <w:r>
-        <w:t xml:space="preserve">Cette scène pose d'emblée un thème majeur du livre : l'incrédulité, presque l'aveuglement volontaire, d'une communauté qui refuse d'imaginer l'impensable.</w:t>
-      </w:r>
-    </w:p>
-    <w:p>
-      <w:pPr>
-        <w:pStyle w:val="Heading3"/>
-      </w:pPr>
-      <w:r>
-        <w:t xml:space="preserve">1944 : l'engrenage</w:t>
-      </w:r>
-    </w:p>
-    <w:p>
-      <w:pPr>
-        <w:spacing w:after="120"/>
-        <w:ind w:firstLine="340"/>
-        <w:jc w:val="both"/>
-      </w:pPr>
-      <w:r>
-        <w:t xml:space="preserve">Pendant les années 1942 et 1943, la vie reprend son cours ; on écoute chaque soir la radio de Londres en guettant la fin de la guerre. Eliezer supplie alors son père de tout vendre et d'émigrer en Palestine tant qu'il en est encore temps, mais celui-ci répond qu'il est trop vieux pour recommencer sa vie dans un pays lointain. Moshé lui-même ne parle plus de ce qu'il a vu, comme si sa voix s'était éteinte. Au printemps 1944, les nouvelles de la défaite allemande sur le front russe nourrissent l'optimisme : on se persuade que la guerre touche à sa fin et que les Juifs de Hongrie seront épargnés. Même lorsque les troupes allemandes entrent dans le pays puis s'installent à Sighet, les habitants se laissent rassurer par la politesse des officiers logés chez l'habitant.</w:t>
-      </w:r>
-    </w:p>
-    <w:p>
-      <w:pPr>
-        <w:spacing w:after="120"/>
-        <w:ind w:firstLine="340"/>
-        <w:jc w:val="both"/>
-      </w:pPr>
-      <w:r>
-        <w:t xml:space="preserve">Les mesures se succèdent alors en quelques semaines, selon une progression méthodique. Pendant la Pâque juive, les dirigeants de la communauté sont arrêtés. Les Juifs se voient interdire de quitter leur domicile pendant trois jours, puis de posséder de l'or ou des bijoux ; vient ensuite l'obligation de porter l'étoile jaune. Le père d'Eliezer minimise : l'étoile, après tout, n'est pas mortelle. Bientôt deux ghettos sont créés, entourés de barbelés, et une sorte de vie communautaire s'y organise, presque paisible, comme si l'enfermement offrait une illusion de protection.</w:t>
-      </w:r>
-    </w:p>
-    <w:p>
-      <w:pPr>
-        <w:spacing w:after="120"/>
-        <w:ind w:firstLine="340"/>
-        <w:jc w:val="both"/>
-      </w:pPr>
-      <w:r>
-        <w:t xml:space="preserve">Puis tombe la nouvelle de la déportation. Le père d'Eliezer l'apprend lors d'une réunion du conseil juif ; un ami officier de la police hongroise avait promis de prévenir la famille en frappant au volet, mais lorsque quelqu'un frappe enfin, il est trop tard. Maria, l'ancienne servante de la famille, chrétienne, vient leur proposer de se réfugier dans son village. Le père refuse, et la famille choisit de ne pas se séparer. Eliezer assiste au départ des premiers convois sous les coups des gendarmes hongrois ; les rues se jonchent de valises, d'objets abandonnés. Sa famille, transférée dans le petit ghetto, part parmi les derniers. Pour la première fois, Eliezer voit son père pleurer. Le dernier convoi quitte Sighet : c'est la fin de l'enfance et du monde d'avant.</w:t>
+        <w:t xml:space="preserve">Un jour, on expulse de Sighet les Juifs étrangers. Moshé, qui en est, est entassé par les gendarmes hongrois dans des wagons à bestiaux. On pleure, puis on oublie ; on se dit qu'ils travaillent en Galicie. Des mois plus tard, Eliezer retrouve Moshé assis sur un banc près de la synagogue. Il raconte : passé la frontière polonaise, la Gestapo a pris en charge les déportés, les a conduits dans une forêt de Galicie, leur a fait creuser de grandes fosses, puis les a abattus ; des bébés étaient lancés en l'air pour servir de cibles aux mitraillettes. Blessé à la jambe et laissé pour mort, Moshé s'est échappé. Il va de maison en maison répéter son récit : il est revenu pour avertir, pour raconter sa propre mort. Personne ne le croit, on le dit fou ; Eliezer lui-même n'y croit pas. Moshé ne parle plus ni de Dieu ni de la Kabbale, seulement de ce qu'il a vu.</w:t>
+      </w:r>
+    </w:p>
+    <w:p>
+      <w:pPr>
+        <w:pStyle w:val="Heading3"/>
+      </w:pPr>
+      <w:r>
+        <w:t xml:space="preserve">1942-1944 : l'engrenage</w:t>
+      </w:r>
+    </w:p>
+    <w:p>
+      <w:pPr>
+        <w:spacing w:after="120"/>
+        <w:ind w:firstLine="340"/>
+        <w:jc w:val="both"/>
+      </w:pPr>
+      <w:r>
+        <w:t xml:space="preserve">En 1942 et 1943, la vie redevient normale. On écoute chaque soir la radio de Londres. Eliezer supplie son père de tout vendre pour émigrer en Palestine ; celui-ci répond qu'il est trop vieux pour recommencer sa vie dans un pays lointain. Au printemps 1944, les nouvelles du front russe rassurent tout le monde : la guerre va finir, et l'on ne croit pas qu'Hitler veuille exterminer tout un peuple. Même l'arrivée au pouvoir des fascistes à Budapest, puis l'entrée des troupes allemandes en Hongrie, n'inquiètent guère. Bientôt les Allemands sont à Sighet : leurs officiers, logés chez des familles juives, se montrent polis ; l'un d'eux offre même des chocolats à son hôtesse, Mme Kahn.</w:t>
+      </w:r>
+    </w:p>
+    <w:p>
+      <w:pPr>
+        <w:spacing w:after="120"/>
+        <w:ind w:firstLine="340"/>
+        <w:jc w:val="both"/>
+      </w:pPr>
+      <w:r>
+        <w:t xml:space="preserve">Le septième jour de la Pâque juive, les dirigeants de la communauté sont arrêtés. Interdiction est faite aux Juifs de quitter leur maison pendant trois jours, sous peine de mort. La police hongroise confisque l'or, les bijoux et les objets de valeur ; le père enterre ses économies dans la cave. Vient ensuite l'étoile jaune, que le père accueille en disant qu'on n'en meurt pas ; le narrateur, avec le recul, lui demande de quoi il est donc mort. D'autres interdictions suivent (cafés, trains, couvre-feu). Puis deux ghettos sont créés, un grand au centre de la ville, un petit dans un faubourg. La maison familiale se trouve dans le grand ghetto ; ses fenêtres sur la rue sont condamnées. Derrière les barbelés, une petite vie juive s'organise, avec son conseil et sa police ; beaucoup y voient presque une protection.</w:t>
+      </w:r>
+    </w:p>
+    <w:p>
+      <w:pPr>
+        <w:pStyle w:val="Heading3"/>
+      </w:pPr>
+      <w:r>
+        <w:t xml:space="preserve">Le départ</w:t>
+      </w:r>
+    </w:p>
+    <w:p>
+      <w:pPr>
+        <w:spacing w:after="120"/>
+        <w:ind w:firstLine="340"/>
+        <w:jc w:val="both"/>
+      </w:pPr>
+      <w:r>
+        <w:t xml:space="preserve">Un samedi soir, peu avant la Pentecôte juive, le père est convoqué d'urgence au conseil. Il revient vers minuit, blême : la déportation commence dès le lendemain, rue après rue, vers une destination inconnue. Pendant qu'il était absent, on a frappé à une fenêtre condamnée ; le temps de l'ouvrir, il n'y avait plus personne. La famille comprendra plus tard que c'était un inspecteur de la police hongroise, ami du père, qui avait promis de les avertir.</w:t>
+      </w:r>
+    </w:p>
+    <w:p>
+      <w:pPr>
+        <w:spacing w:after="120"/>
+        <w:ind w:firstLine="340"/>
+        <w:jc w:val="both"/>
+      </w:pPr>
+      <w:r>
+        <w:t xml:space="preserve">Au matin, les gendarmes hongrois, à coups de crosse et de matraque, rassemblent les premiers partants dans les rues. Ils attendent des heures sous un soleil brûlant ; Eliezer et les siens, encore épargnés, leur apportent de l'eau. Il voit passer ses maîtres, ses amis, le rabbin voûté, au visage rasé. Les rues restent jonchées de valises éventrées et d'objets abandonnés. La famille d'Eliezer, désignée pour le dernier convoi, est d'abord transférée dans le petit ghetto. En chemin, Eliezer voit son père pleurer pour la première fois ; la petite Tzipora marche, un manteau rouge sur le bras.</w:t>
+      </w:r>
+    </w:p>
+    <w:p>
+      <w:pPr>
+        <w:spacing w:after="120"/>
+        <w:ind w:firstLine="340"/>
+        <w:jc w:val="both"/>
+      </w:pPr>
+      <w:r>
+        <w:t xml:space="preserve">Dans le petit ghetto, Martha, l'ancienne servante chrétienne de la famille, vient en pleurant leur offrir un abri dans son village. Le père refuse pour lui-même et laisse ses enfants libres d'accepter, mais personne ne veut se séparer. Quelques jours plus tard, les derniers Juifs de Sighet sont conduits à la gare. Les gendarmes les font monter dans des wagons à bestiaux, environ quatre-vingts par wagon, avec un peu de pain et quelques seaux d'eau. Les wagons sont scellés ; dans chacun, un responsable répondra de sa vie de toute évasion. Sur le quai, deux officiers de la Gestapo se promènent en souriant. Le train s'ébranle.</w:t>
       </w:r>
     </w:p>
     <w:p>
@@ -410,47 +428,47 @@
         <w:jc w:val="both"/>
       </w:pPr>
       <w:r>
-        <w:t xml:space="preserve">Les Juifs de Sighet sont entassés à quatre-vingts par wagon à bestiaux, sans pouvoir s'allonger, si bien qu'ils doivent se relayer pour s'asseoir. L'air manque, la chaleur devient vite insupportable, et la soif tourmente chacun. Dans la promiscuité et l'obscurité, toute pudeur s'efface : quelques jeunes cèdent à leurs instincts au milieu des autres, qui détournent les yeux. Ce détail montre combien le voyage commence déjà à défaire les liens et les règles qui structuraient la communauté. Les familles partagent les dernières provisions emportées du ghetto et, malgré tout, chacun se raccroche à l'idée qu'on les conduit vers un camp de travail en Hongrie même.</w:t>
-      </w:r>
-    </w:p>
-    <w:p>
-      <w:pPr>
-        <w:spacing w:after="120"/>
-        <w:ind w:firstLine="340"/>
-        <w:jc w:val="both"/>
-      </w:pPr>
-      <w:r>
-        <w:t xml:space="preserve">À Kaschau, ville située à la frontière tchécoslovaque, le convoi s'arrête. Les déportés comprennent alors qu'ils quittent la Hongrie. Un officier allemand monte à bord, accompagné d'un interprète, et annonce qu'ils passent désormais sous l'autorité de l'armée allemande. Il exige que l'on remette l'or, l'argent et les montres, et prévient que si une seule personne manque à l'appel, tous seront fusillés « comme des chiens ». Les portes sont ensuite refermées et clouées : le wagon devient une prison scellée.</w:t>
-      </w:r>
-    </w:p>
-    <w:p>
-      <w:pPr>
-        <w:spacing w:after="120"/>
-        <w:ind w:firstLine="340"/>
-        <w:jc w:val="both"/>
-      </w:pPr>
-      <w:r>
-        <w:t xml:space="preserve">Parmi les voyageurs se trouve Madame Schächter, une femme d'une cinquantaine d'années, accompagnée de son fils de dix ans, recroquevillé dans un coin. Son mari et ses deux fils aînés ont été emmenés par erreur avec le premier convoi, et cette séparation l'a brisée. Le troisième soir, elle se met soudain à hurler : « Un feu ! Je vois un feu ! ». Certains se précipitent vers la lucarne, mais ne voient que la nuit. Ses cris reviennent, encore et encore ; les voyageurs, déjà à bout de nerfs, la croient folle et finissent par la frapper, la ligoter et la bâillonner pour la faire taire. Son petit garçon assiste, impuissant, à cette scène. La violence n'est plus seulement le fait des bourreaux : la peur et l'épuisement la font naître parmi les victimes elles-mêmes.</w:t>
-      </w:r>
-    </w:p>
-    <w:p>
-      <w:pPr>
-        <w:spacing w:after="120"/>
-        <w:ind w:firstLine="340"/>
-        <w:jc w:val="both"/>
-      </w:pPr>
-      <w:r>
-        <w:t xml:space="preserve">Le train finit par s'arrêter dans une gare dont le nom, Auschwitz, ne dit rien à personne. Deux hommes autorisés à aller chercher de l'eau rapportent des nouvelles rassurantes : il s'agirait d'un camp de travail où les familles resteraient ensemble, les jeunes à l'usine et les vieux aux champs. Le soulagement est de courte durée. La nuit venue, Madame Schächter crie de nouveau et reçoit encore des coups, avant de sombrer dans le silence.</w:t>
-      </w:r>
-    </w:p>
-    <w:p>
-      <w:pPr>
-        <w:spacing w:after="120"/>
-        <w:ind w:firstLine="340"/>
-        <w:jc w:val="both"/>
-      </w:pPr>
-      <w:r>
-        <w:t xml:space="preserve">Lorsque le convoi repart et s'immobilise enfin, vers minuit, les déportés aperçoivent des flammes qui s'élèvent d'une haute cheminée, tandis qu'une odeur de chair brûlée envahit l'air. La femme que tous prenaient pour une démente se révèle ainsi une prophétesse que personne n'a voulu écouter, et sa vision de feu devient réalité. Les portes s'ouvrent sur d'étranges individus en veste rayée, armés de bâtons, qui font descendre les déportés à coups de cris : le train est arrivé à Birkenau, le centre d'accueil d'Auschwitz, où la nuit ne fait que commencer.</w:t>
+        <w:t xml:space="preserve">Les Juifs de Sighet sont entassés à quatre-vingts par wagon à bestiaux. Impossible de s'allonger, ni même de s'asseoir tous à la fois : on se relaie. L'air manque ; seuls les plus chanceux sont près de la lucarne. Au bout de deux jours, la soif et la chaleur deviennent intolérables. Dans l'obscurité, quelques jeunes, libérés de toute retenue, se caressent sans se soucier des autres, qui font semblant de ne rien voir. On rationne les dernières provisions.</w:t>
+      </w:r>
+    </w:p>
+    <w:p>
+      <w:pPr>
+        <w:spacing w:after="120"/>
+        <w:ind w:firstLine="340"/>
+        <w:jc w:val="both"/>
+      </w:pPr>
+      <w:r>
+        <w:t xml:space="preserve">Le train s'arrête à Kaschau, petite ville à la frontière tchécoslovaque. Les déportés comprennent alors qu'ils ne restent pas en Hongrie, mais trop tard. Un officier allemand monte dans le wagon avec un lieutenant hongrois qui lui sert d'interprète. Il annonce qu'ils sont désormais sous l'autorité de l'armée allemande, ordonne de remettre l'or, l'argent et les montres sous peine d'être fusillé sur-le-champ. Le lieutenant passe avec un panier ramasser les derniers biens. L'officier prévient enfin que si un seul des quatre-vingts manque, tous seront fusillés « comme des chiens ». Les portes sont refermées et clouées : tout retour est impossible, le monde se réduit à ce wagon hermétiquement clos.</w:t>
+      </w:r>
+    </w:p>
+    <w:p>
+      <w:pPr>
+        <w:spacing w:after="120"/>
+        <w:ind w:firstLine="340"/>
+        <w:jc w:val="both"/>
+      </w:pPr>
+      <w:r>
+        <w:t xml:space="preserve">Parmi les voyageurs se trouve Madame Schächter, une femme d'une cinquantaine d'années qu'Elie connaît bien, car elle a souvent été reçue chez ses parents. Son fils de dix ans est avec elle, blotti dans un coin ; son mari et ses deux fils aînés sont partis par erreur avec le premier convoi, et cette séparation l'a brisée. La troisième nuit, un cri déchire le silence : « Un feu ! Je vois un feu ! ». Certains se ruent vers la lucarne mais ne voient que la nuit. Elle continue de hurler aux flammes, à la fournaise, tandis que son petit garçon s'accroche à sa jupe en la suppliant de se calmer. À bout de nerfs, des jeunes gens la font asseoir de force, la ligotent et la bâillonnent ; comme elle recommence, elle est frappée à coups qui auraient pu la tuer, sous les yeux de son fils muet.</w:t>
+      </w:r>
+    </w:p>
+    <w:p>
+      <w:pPr>
+        <w:spacing w:after="120"/>
+        <w:ind w:firstLine="340"/>
+        <w:jc w:val="both"/>
+      </w:pPr>
+      <w:r>
+        <w:t xml:space="preserve">Plus tard, le train entre dans une gare : ceux qui sont près des fenêtres lisent « Auschwitz », un nom que personne ne connaît. Deux hommes sont autorisés à aller chercher de l'eau ; grâce à une montre en or échangée contre des renseignements, ils ont appris que c'est le terminus : un camp de travail où les familles ne seront pas séparées, les jeunes iront à l'usine, les vieux et les malades aux champs. Mais le soir, Madame Schächter hurle de nouveau qu'elle voit le feu ; on la ligote, on la bâillonne et on la frappe encore.</w:t>
+      </w:r>
+    </w:p>
+    <w:p>
+      <w:pPr>
+        <w:spacing w:after="120"/>
+        <w:ind w:firstLine="340"/>
+        <w:jc w:val="both"/>
+      </w:pPr>
+      <w:r>
+        <w:t xml:space="preserve">Vers onze heures, le train repart lentement. Par les fenêtres, on aperçoit des barbelés : c'est le camp. On avait oublié Madame Schächter quand elle crie une dernière fois de regarder le feu. Cette fois, tous voient des flammes s'élever d'une haute cheminée dans le ciel noir. Elle se tait alors d'elle-même et retourne, absente, dans son coin. Sa vision, prise pour de la folie, était une prophétie. Soudain les portes s'ouvrent : des êtres étranges en veste rayée et pantalon noir, armés de lampes de poche et de bâtons, frappent à droite et à gauche en criant à tous de descendre et de tout laisser. Le fils de Madame Schächter lui tient toujours la main. Devant eux, les flammes ; dans l'air, une odeur de chair brûlée. Il est environ minuit. Ils sont arrivés à Birkenau.</w:t>
       </w:r>
     </w:p>
     <w:p>
@@ -468,7 +486,7 @@
         <w:jc w:val="both"/>
       </w:pPr>
       <w:r>
-        <w:t xml:space="preserve">À peine les déportés sont-ils descendus sur le quai de Birkenau qu'en quelques secondes tombe l'ordre qui va décider de tout : les hommes à gauche, les femmes à droite. Eliezer et son père voient s'éloigner sa mère et sa petite sœur Tzipora, qui tient la main de sa mère. Le narrateur ne sait pas encore qu'il les voit pour la dernière fois.</w:t>
+        <w:t xml:space="preserve">Sur le quai de Birkenau, les déportés doivent abandonner dans le wagon les objets qu'ils ont emportés jusque-là, et avec eux leurs dernières illusions. Un ordre tombe, prononcé sans émotion : « Hommes à gauche ! Femmes à droite ! » Eliezer part avec son père ; il voit s'éloigner sa mère, qui caresse les cheveux blonds de Tzipora comme pour la protéger, et sa petite sœur qui lui tient la main. Il ne sait pas qu'il les quitte pour toujours.</w:t>
       </w:r>
     </w:p>
     <w:p>
@@ -486,17 +504,25 @@
         <w:jc w:val="both"/>
       </w:pPr>
       <w:r>
-        <w:t xml:space="preserve">Dans la colonne des hommes, un détenu glisse au garçon un conseil qui lui sauve sans doute la vie : il ne doit pas dire qu'il a quinze ans, mais dix-huit, et son père, qui a la cinquantaine, doit se dire âgé de quarante ans. Un autre prisonnier accueille les nouveaux venus avec colère, leur demandant pourquoi ils sont venus jusqu'ici et leur montrant la cheminée où ils finiront. Les plus jeunes parlent un instant de se révolter, mais les anciens les supplient de ne pas abandonner leur foi. Arrive alors la sélection, menée par le Dr Mengele, officier SS au monocle qui tient une baguette comme un chef d'orchestre et désigne d'un geste la droite ou la gauche. Eliezer annonce dix-huit ans et se dit agriculteur ; il est envoyé du même côté que son père. Il ignore encore de quel côté se trouve la mort.</w:t>
-      </w:r>
-    </w:p>
-    <w:p>
-      <w:pPr>
-        <w:spacing w:after="120"/>
-        <w:ind w:firstLine="340"/>
-        <w:jc w:val="both"/>
-      </w:pPr>
-      <w:r>
-        <w:t xml:space="preserve">La colonne se met en marche et s'approche d'une fosse d'où montent d'immenses flammes. Le garçon voit un camion décharger des petits enfants, des bébés, dans le feu. Il se pince pour savoir s'il est encore vivant. Son père pleure et, autour d'eux, des hommes se mettent à réciter le </w:t>
+        <w:t xml:space="preserve">Dans la colonne des hommes, un détenu s'approche et souffle au garçon de ne pas dire qu'il a quinze ans, mais dix-huit ; son père, qui a cinquante ans, doit en annoncer quarante. Un autre prisonnier les accueille par des injures : pourquoi sont-ils venus ? Il leur montre la cheminée et l'odeur de chair brûlée. Quelques jeunes parlent de se jeter sur les gardes, mais les plus âgés les supplient de ne pas perdre la foi. Puis vient la sélection, conduite par le Dr Mengele, officier SS au monocle, qui tient une baguette de chef d'orchestre. Eliezer répond qu'il a dix-huit ans, qu'il est en bonne santé et agriculteur. Il est envoyé à gauche ; son père le rejoint. Personne ne sait encore quel côté mène à la mort.</w:t>
+      </w:r>
+    </w:p>
+    <w:p>
+      <w:pPr>
+        <w:pStyle w:val="Heading3"/>
+      </w:pPr>
+      <w:r>
+        <w:t xml:space="preserve">La fosse</w:t>
+      </w:r>
+    </w:p>
+    <w:p>
+      <w:pPr>
+        <w:spacing w:after="120"/>
+        <w:ind w:firstLine="340"/>
+        <w:jc w:val="both"/>
+      </w:pPr>
+      <w:r>
+        <w:t xml:space="preserve">La colonne avance vers une fosse d'où montent d'immenses flammes. Eliezer voit un camion décharger des petits enfants, des bébés, dans le feu. Il se pince pour être sûr de ne pas rêver. Son père, la voix brisée, regrette qu'il ne soit pas parti avec sa mère ; le garçon dit qu'il se jettera plutôt sur les barbelés électrifiés que de mourir brûlé. Autour d'eux, des hommes récitent le </w:t>
       </w:r>
       <w:r>
         <w:rPr>
@@ -506,63 +532,101 @@
         <w:t xml:space="preserve">Kaddish</w:t>
       </w:r>
       <w:r>
-        <w:t xml:space="preserve">, la prière des morts, pour eux-mêmes. Pour la première fois, Eliezer sent la révolte monter en lui : pourquoi bénir le nom de Dieu, qui laisse brûler des enfants ? À deux pas de la fosse, la colonne tourne et se dirige vers une baraque.</w:t>
-      </w:r>
-    </w:p>
-    <w:p>
-      <w:pPr>
-        <w:pStyle w:val="Heading3"/>
-      </w:pPr>
-      <w:r>
-        <w:t xml:space="preserve">« Jamais je n'oublierai... »</w:t>
-      </w:r>
-    </w:p>
-    <w:p>
-      <w:pPr>
-        <w:spacing w:after="120"/>
-        <w:ind w:firstLine="340"/>
-        <w:jc w:val="both"/>
-      </w:pPr>
-      <w:r>
-        <w:t xml:space="preserve">C'est ici que se place le passage le plus célèbre du livre. Le narrateur, adulte, interrompt son récit pour prononcer une sorte de serment : « Jamais je n'oublierai cette nuit, la première nuit de camp, qui a fait de ma vie une nuit longue et sept fois verrouillée. » Dans une litanie où revient sans cesse la même formule, il jure de ne jamais oublier la fumée, les visages des enfants changés en volutes sous un ciel muet, les flammes qui ont consumé sa foi, le silence nocturne qui lui a ôté pour toujours le désir de vivre, et les instants qui ont assassiné son Dieu et son âme. Il termine en affirmant qu'il ne l'oubliera jamais, même s'il était condamné à vivre aussi longtemps que Dieu. La répétition, qui rappelle une prière, est retournée contre Dieu : la nuit du titre est d'abord celle-ci, celle où meurent à la fois l'enfance et la confiance du jeune croyant.</w:t>
-      </w:r>
-    </w:p>
-    <w:p>
-      <w:pPr>
-        <w:spacing w:after="120"/>
-        <w:ind w:firstLine="340"/>
-        <w:jc w:val="both"/>
-      </w:pPr>
-      <w:r>
-        <w:t xml:space="preserve">Commence ensuite la déshumanisation méthodique. Dans la baraque, les déportés sont mis à nu, rasés de la tête aux pieds, plongés dans un bain de désinfection, puis douchés ; on leur jette des vêtements dépareillés qui les rendent grotesques. Quand son père, pris de coliques, demande poliment au kapo tzigane où se trouvent les toilettes, celui-ci le frappe si violemment qu'il tombe. Eliezer ne bouge pas : la veille encore, il aurait sauté à la gorge de l'agresseur. Il mesure avec honte combien il a déjà changé.</w:t>
-      </w:r>
-    </w:p>
-    <w:p>
-      <w:pPr>
-        <w:pStyle w:val="Heading3"/>
-      </w:pPr>
-      <w:r>
-        <w:t xml:space="preserve">D'Auschwitz à Buna</w:t>
-      </w:r>
-    </w:p>
-    <w:p>
-      <w:pPr>
-        <w:spacing w:after="120"/>
-        <w:ind w:firstLine="340"/>
-        <w:jc w:val="both"/>
-      </w:pPr>
-      <w:r>
-        <w:t xml:space="preserve">Les hommes marchent ensuite jusqu'au camp d'Auschwitz, dont le portail porte l'inscription « Le travail, c'est la liberté ». Un SS leur rappelle qu'ils sont dans un camp de concentration et qu'ils doivent travailler ou finir au crématoire. Le chef de leur bloc, un Polonais, leur adresse au contraire quelques paroles humaines, les exhortant à s'entraider et à garder espoir. On tatoue sur le bras gauche du garçon le matricule A-7713 : il n'a plus de nom, seulement un numéro.</w:t>
-      </w:r>
-    </w:p>
-    <w:p>
-      <w:pPr>
-        <w:spacing w:after="120"/>
-        <w:ind w:firstLine="340"/>
-        <w:jc w:val="both"/>
-      </w:pPr>
-      <w:r>
-        <w:t xml:space="preserve">Un soir, un homme les cherche : c'est Stein, un parent venu d'Anvers, le mari de Reizel, la sœur de la mère d'Eliezer. Il espère des nouvelles de sa femme et de ses enfants. Eliezer lui ment et affirme que sa mère en a reçu et qu'ils vont bien. Stein revient plusieurs fois, apportant parfois un morceau de pain, puis cesse de venir : il a appris la vérité par de nouveaux déportés. Après environ trois semaines, Eliezer et son père quittent Auschwitz pour le camp de travail de Buna : une longue marche sous le soleil du printemps les y conduit.</w:t>
+        <w:t xml:space="preserve">, la prière des morts, pour eux-mêmes ; son père le récite aussi. Pour la première fois, Eliezer sent la révolte monter : pourquoi sanctifier le nom d'un Dieu qui se tait ? À deux pas de la fosse, la colonne tourne et se dirige vers une baraque. Eliezer rappelle à son père Mme Schächter et ses visions de feu dans le train.</w:t>
+      </w:r>
+    </w:p>
+    <w:p>
+      <w:pPr>
+        <w:pStyle w:val="Heading3"/>
+      </w:pPr>
+      <w:r>
+        <w:t xml:space="preserve">« Jamais je n'oublierai »</w:t>
+      </w:r>
+    </w:p>
+    <w:p>
+      <w:pPr>
+        <w:spacing w:after="120"/>
+        <w:ind w:firstLine="340"/>
+        <w:jc w:val="both"/>
+      </w:pPr>
+      <w:r>
+        <w:t xml:space="preserve">Le narrateur suspend alors son récit pour une sorte de serment : « Jamais je n'oublierai cette nuit, la première nuit de camp, qui a fait de ma vie une nuit longue et sept fois verrouillée. » La même formule revient comme une litanie : il n'oubliera jamais la fumée, les petits visages des enfants dont les corps se sont changés en volutes sous un ciel muet, les flammes qui ont consumé sa foi, le silence nocturne qui lui a ôté le désir de vivre, les instants qui ont assassiné son Dieu et son âme. Cette prière retournée contre Dieu donne son sens au titre du livre.</w:t>
+      </w:r>
+    </w:p>
+    <w:p>
+      <w:pPr>
+        <w:pStyle w:val="Heading3"/>
+      </w:pPr>
+      <w:r>
+        <w:t xml:space="preserve">La baraque</w:t>
+      </w:r>
+    </w:p>
+    <w:p>
+      <w:pPr>
+        <w:spacing w:after="120"/>
+        <w:ind w:firstLine="340"/>
+        <w:jc w:val="both"/>
+      </w:pPr>
+      <w:r>
+        <w:t xml:space="preserve">Dans la baraque, les détenus doivent se déshabiller en ne gardant que leur ceinture et leurs chaussures. On les rase de la tête aux pieds, on les plonge dans un bain de désinfection, puis sous une douche chaude, avant de les faire courir nus jusqu'à une autre baraque où on leur lance des vêtements dépareillés. En un rien de temps, ils ont cessé d'être des hommes. L'élève du Talmud qu'était Eliezer a brûlé dans les flammes : il ne reste qu'une forme qui lui ressemble. Un officier SS leur annonce qu'ils sont à Auschwitz et qu'ils ont le choix entre le travail et le crématoire.</w:t>
+      </w:r>
+    </w:p>
+    <w:p>
+      <w:pPr>
+        <w:spacing w:after="120"/>
+        <w:ind w:firstLine="340"/>
+        <w:jc w:val="both"/>
+      </w:pPr>
+      <w:r>
+        <w:t xml:space="preserve">Le kapo de la baraque est un Tzigane. Quand le père d'Eliezer, pris de coliques, lui demande poliment où se trouvent les toilettes, il le gifle si fort qu'il tombe. Eliezer ne bouge pas. La veille encore, il aurait enfoncé ses ongles dans la chair de l'agresseur ; il mesure avec honte combien il a changé. Son père lui murmure que cela ne fait pas mal.</w:t>
+      </w:r>
+    </w:p>
+    <w:p>
+      <w:pPr>
+        <w:pStyle w:val="Heading3"/>
+      </w:pPr>
+      <w:r>
+        <w:t xml:space="preserve">Auschwitz</w:t>
+      </w:r>
+    </w:p>
+    <w:p>
+      <w:pPr>
+        <w:spacing w:after="120"/>
+        <w:ind w:firstLine="340"/>
+        <w:jc w:val="both"/>
+      </w:pPr>
+      <w:r>
+        <w:t xml:space="preserve">Au matin, on conduit la colonne à travers des barbelés électrifiés jusqu'au camp d'Auschwitz, dont le portail porte l'inscription </w:t>
+      </w:r>
+      <w:r>
+        <w:rPr>
+          <w:i/>
+          <w:iCs/>
+        </w:rPr>
+        <w:t xml:space="preserve">Arbeit macht frei</w:t>
+      </w:r>
+      <w:r>
+        <w:t xml:space="preserve">, « le travail, c'est la liberté ». Après une nouvelle douche, les déportés sont installés au bloc 17. Le responsable du bloc, un jeune Polonais, leur parle avec humanité : ils doivent tenir, garder espoir et s'entraider, car ils sont tous frères. Ce sont les premières paroles humaines qu'ils entendent. Le lendemain, on tatoue sur le bras gauche d'Eliezer le matricule A-7713 : désormais, il n'a plus d'autre nom.</w:t>
+      </w:r>
+    </w:p>
+    <w:p>
+      <w:pPr>
+        <w:spacing w:after="120"/>
+        <w:ind w:firstLine="340"/>
+        <w:jc w:val="both"/>
+      </w:pPr>
+      <w:r>
+        <w:t xml:space="preserve">Eliezer ne prie plus : il ne nie pas l'existence de Dieu, mais il doute désormais de sa justice. Un soir, un homme les cherche : c'est Stein, venu d'Anvers, le mari de Reizel, la sœur de sa mère. Il demande des nouvelles de sa femme et de ses enfants. Eliezer lui ment et affirme que sa mère en a reçu et qu'ils vont bien. Stein revient plusieurs fois, apportant parfois une demi-ration de pain, et confie que seule l'idée de les savoir vivants le fait tenir. Puis il ne revient plus : des déportés arrivés d'Anvers lui ont appris la vérité.</w:t>
+      </w:r>
+    </w:p>
+    <w:p>
+      <w:pPr>
+        <w:spacing w:after="120"/>
+        <w:ind w:firstLine="340"/>
+        <w:jc w:val="both"/>
+      </w:pPr>
+      <w:r>
+        <w:t xml:space="preserve">Au bout d'environ trois semaines, Eliezer et son père quittent Auschwitz avec un convoi de travailleurs. Une marche de quelques heures, sous le soleil du printemps, les mène au camp de Buna.</w:t>
       </w:r>
     </w:p>
     <w:p>
@@ -580,7 +644,7 @@
         <w:jc w:val="both"/>
       </w:pPr>
       <w:r>
-        <w:t xml:space="preserve">Eliezer et son père arrivent à Buna, un camp de travail rattaché à Auschwitz qui paraît presque désert. Après une nouvelle sélection et une visite médicale, un dentiste examine la bouche des détenus : il ne cherche pas à soigner, il recense les dents en or. Eliezer, qui porte une couronne en or, doit se présenter pour l'extraction ; il se dit malade une première fois, puis une seconde, et obtient chaque fois un délai. Peu après, le cabinet est fermé et le dentiste arrêté pour avoir trafiqué les dents des prisonniers. Le garçon n'éprouve aucune pitié : il est seulement soulagé de garder cette couronne, qui pourrait un jour lui servir à acheter du pain. La faim a déjà déplacé toutes les valeurs.</w:t>
+        <w:t xml:space="preserve">Buna est un grand camp de travail qui semble sortir d'une épidémie, vide et mort. Après une visite médicale expéditive, un dentiste examine les bouches, non pour soigner, mais pour repérer les dents en or. Eliezer, qui porte une couronne en or, voit son numéro inscrit sur une liste.</w:t>
       </w:r>
     </w:p>
     <w:p>
@@ -598,37 +662,75 @@
         <w:jc w:val="both"/>
       </w:pPr>
       <w:r>
-        <w:t xml:space="preserve">Le père et le fils sont affectés à un entrepôt de matériel électrique, où l'on compte des ampoules et des pièces détachées. Le travail n'est pas épuisant et l'équipe compte les musiciens du camp, parmi lesquels Juliek, un violoniste polonais. Eliezer se lie avec Yossi et Tibi, deux frères tchécoslovaques dont les parents ont été exterminés à Birkenau. Ils parlent du sionisme, chantent des mélodies hébraïques et se promettent de partir pour la Palestine une fois la guerre finie. Ces rêves d'avenir, partagés à voix basse, rappellent qu'au cœur du camp subsiste encore une part d'humanité.</w:t>
-      </w:r>
-    </w:p>
-    <w:p>
-      <w:pPr>
-        <w:spacing w:after="120"/>
-        <w:ind w:firstLine="340"/>
-        <w:jc w:val="both"/>
-      </w:pPr>
-      <w:r>
-        <w:t xml:space="preserve">Ce répit est fragile. Le kapo Idek est sujet à de brusques accès de folie. Un jour, sans motif, il se jette sur Eliezer et le roue de coups. Une jeune Française, une Juive qui se fait passer pour aryenne, lui glisse ensuite quelques mots de réconfort en allemand ; bien des années plus tard, Eliezer la reconnaîtra par hasard dans le métro parisien. Une autre fois, Idek frappe le père d'Eliezer à coups de barre de fer. Le fils, témoin de la scène, ne bouge pas, et ce qu'il découvre en lui le bouleverse : sa colère se tourne non contre le kapo, mais contre son père, à qui il reproche de ne pas avoir su éviter les coups. Le camp commence à ronger les liens les plus intimes.</w:t>
-      </w:r>
-    </w:p>
-    <w:p>
-      <w:pPr>
-        <w:spacing w:after="120"/>
-        <w:ind w:firstLine="340"/>
-        <w:jc w:val="both"/>
-      </w:pPr>
-      <w:r>
-        <w:t xml:space="preserve">Franek, le contremaître, un ancien étudiant de Varsovie, convoite la couronne en or. Sur le conseil de son père, Eliezer refuse. Franek trouve alors le point faible : le père, incapable de marcher au pas, est frappé chaque jour pour cette raison. Eliezer tente en vain de lui apprendre la cadence, puis finit par céder. Un dentiste de Varsovie lui arrache la couronne avec une cuillère rouillée. Quelque temps plus tard, les Polonais sont transférés ailleurs et Eliezer perd sa dent pour rien.</w:t>
-      </w:r>
-    </w:p>
-    <w:p>
-      <w:pPr>
-        <w:spacing w:after="120"/>
-        <w:ind w:firstLine="340"/>
-        <w:jc w:val="both"/>
-      </w:pPr>
-      <w:r>
-        <w:t xml:space="preserve">Un dimanche, Eliezer surprend Idek avec une jeune Polonaise à demi nue dans l'entrepôt. Il reçoit bientôt, devant tous les détenus, vingt-cinq coups de fouet, qu'il compte un à un jusqu'à s'évanouir. Idek le menace de bien pire s'il parle de ce qu'il a vu.</w:t>
+        <w:t xml:space="preserve">Le père et le fils restent ensemble et sont logés au bloc des musiciens, puis affectés à un entrepôt de matériel électrique : on y compte surtout des ampoules et des boulons. Chaque matin, l'orchestre joue des marches militaires à la porte du camp. Juliek, un violoniste polonais à lunettes, au sourire cynique, les prévient : le travail n'est pas dur, mais le kapo Idek a des accès de folie, et il vaut mieux alors ne pas croiser son chemin.</w:t>
+      </w:r>
+    </w:p>
+    <w:p>
+      <w:pPr>
+        <w:spacing w:after="120"/>
+        <w:ind w:firstLine="340"/>
+        <w:jc w:val="both"/>
+      </w:pPr>
+      <w:r>
+        <w:t xml:space="preserve">Eliezer se lie avec Yossi et Tibi, deux frères tchécoslovaques dont les parents ont été exterminés à Birkenau. Ils parlent de la Palestine, chantent à voix basse des mélodies hébraïques, et décident, s'ils survivent, de quitter l'Europe par le premier bateau pour Haïfa.</w:t>
+      </w:r>
+    </w:p>
+    <w:p>
+      <w:pPr>
+        <w:spacing w:after="120"/>
+        <w:ind w:firstLine="340"/>
+        <w:jc w:val="both"/>
+      </w:pPr>
+      <w:r>
+        <w:t xml:space="preserve">Quelques jours plus tard, Eliezer est convoqué chez le dentiste pour qu'on lui arrache sa couronne. Il se dit malade et obtient un délai, puis un second. Peu après, le cabinet est fermé : le dentiste a été jeté en prison pour avoir trafiqué les dents en or des détenus. Eliezer n'éprouve aucune pitié ; il se réjouit de garder une couronne qui pourra un jour lui acheter du pain.</w:t>
+      </w:r>
+    </w:p>
+    <w:p>
+      <w:pPr>
+        <w:pStyle w:val="Heading3"/>
+      </w:pPr>
+      <w:r>
+        <w:t xml:space="preserve">Idek, Franek et le fouet</w:t>
+      </w:r>
+    </w:p>
+    <w:p>
+      <w:pPr>
+        <w:spacing w:after="120"/>
+        <w:ind w:firstLine="340"/>
+        <w:jc w:val="both"/>
+      </w:pPr>
+      <w:r>
+        <w:t xml:space="preserve">Un jour, dans l'entrepôt, Idek est pris d'une crise de rage et se jette sur Eliezer, qu'il roue de coups. Une jeune Française qui travaille à côté de lui essuie son front ensanglanté et lui murmure en allemand de garder sa colère et sa haine pour plus tard. Des années après, Eliezer la reconnaît par hasard dans le métro parisien : elle était juive et vivait au camp sous de faux papiers d'« aryenne ».</w:t>
+      </w:r>
+    </w:p>
+    <w:p>
+      <w:pPr>
+        <w:spacing w:after="120"/>
+        <w:ind w:firstLine="340"/>
+        <w:jc w:val="both"/>
+      </w:pPr>
+      <w:r>
+        <w:t xml:space="preserve">Une autre fois, Idek frappe le père d'Eliezer à coups de barre de fer. Le fils regarde sans bouger et découvre en lui une réaction qui l'effraie : sa colère se tourne non contre le kapo, mais contre son père, à qui il reproche de ne pas avoir su éviter la crise d'Idek.</w:t>
+      </w:r>
+    </w:p>
+    <w:p>
+      <w:pPr>
+        <w:spacing w:after="120"/>
+        <w:ind w:firstLine="340"/>
+        <w:jc w:val="both"/>
+      </w:pPr>
+      <w:r>
+        <w:t xml:space="preserve">Franek, le contremaître, un ancien étudiant de Varsovie, exige la couronne en or. Eliezer consulte son père, qui refuse. Franek s'en prend alors au vieil homme : incapable de marcher au pas, celui-ci est battu tous les jours. Eliezer tente de lui apprendre la cadence puis finit par céder. Un dentiste de Varsovie lui arrache la couronne aux latrines, avec une cuillère rouillée. Franek redevient aimable et lui donne parfois un supplément de soupe, mais deux semaines plus tard, tous les Polonais sont transférés dans d'autres camps : Eliezer a perdu sa dent pour rien.</w:t>
+      </w:r>
+    </w:p>
+    <w:p>
+      <w:pPr>
+        <w:spacing w:after="120"/>
+        <w:ind w:firstLine="340"/>
+        <w:jc w:val="both"/>
+      </w:pPr>
+      <w:r>
+        <w:t xml:space="preserve">Un dimanche où Idek a fait venir le kommando à l'entrepôt, Eliezer le surprend avec une jeune Polonaise à demi nue sur une paillasse. Le soir, à l'appel, Idek le fait étendre sur une caisse et lui inflige vingt-cinq coups de fouet devant tous les détenus. Eliezer compte les coups jusqu'à s'évanouir. Idek lui promet cinq fois plus s'il raconte ce qu'il a vu.</w:t>
       </w:r>
     </w:p>
     <w:p>
@@ -646,37 +748,37 @@
         <w:jc w:val="both"/>
       </w:pPr>
       <w:r>
-        <w:t xml:space="preserve">Un autre dimanche, les sirènes annoncent un bombardement allié. Les SS se réfugient dans les abris, abandonnant au milieu du camp deux chaudrons de soupe. Un détenu, rendu fou par la faim, rampe vers eux ; il est abattu au moment où il les atteint. Les bombes tombent sur l'usine, et les prisonniers, loin d'avoir peur, se réjouissent de voir enfin frapper les bourreaux.</w:t>
-      </w:r>
-    </w:p>
-    <w:p>
-      <w:pPr>
-        <w:spacing w:after="120"/>
-        <w:ind w:firstLine="340"/>
-        <w:jc w:val="both"/>
-      </w:pPr>
-      <w:r>
-        <w:t xml:space="preserve">Une semaine plus tard, une potence est dressée sur la place d'appel. Un jeune homme de Varsovie, accusé d'avoir volé pendant l'alerte, est pendu devant tout le camp ; il meurt en criant son espoir de liberté et en maudissant l'Allemagne. Les détenus doivent défiler devant le corps. Ce soir-là, Eliezer trouve la soupe excellente : l'habitude de la mort émousse déjà les consciences.</w:t>
-      </w:r>
-    </w:p>
-    <w:p>
-      <w:pPr>
-        <w:spacing w:after="120"/>
-        <w:ind w:firstLine="340"/>
-        <w:jc w:val="both"/>
-      </w:pPr>
-      <w:r>
-        <w:t xml:space="preserve">La pendaison suivante est d'une tout autre nature. Après un sabotage de la centrale électrique et la découverte d'armes, un Oberkapo néerlandais est torturé puis envoyé à Auschwitz. Son pipel, un petit garçon au visage d'ange triste, aimé de tous, refuse lui aussi de parler. Il est conduit à la potence avec deux adultes. Les hommes meurent vite, mais l'enfant, trop léger, agonise pendant plus d'une demi-heure sous les yeux des prisonniers contraints de défiler devant lui. Derrière Eliezer, un homme demande : « Où est le bon Dieu, où est-il ? » En lui-même, Eliezer entend une voix répondre que Dieu est là, pendu à cette potence. Ce soir-là, la soupe a un goût de cadavre.</w:t>
-      </w:r>
-    </w:p>
-    <w:p>
-      <w:pPr>
-        <w:spacing w:after="120"/>
-        <w:ind w:firstLine="340"/>
-        <w:jc w:val="both"/>
-      </w:pPr>
-      <w:r>
-        <w:t xml:space="preserve">Ce chapitre marque un tournant : avec la mort de l'enfant, c'est la foi d'Eliezer qui vacille, comme si l'innocence et Dieu lui-même avaient été exécutés ensemble.</w:t>
+        <w:t xml:space="preserve">Un autre dimanche, alors que son père est parti au travail avec la moitié du groupe, Eliezer reste au bloc. Vers dix heures, les sirènes annoncent une alerte aérienne. Les SS se réfugient dans les abris et laissent au milieu du camp deux chaudrons de soupe. Un détenu, rendu fou par la faim, rampe jusqu'à eux ; une balle l'abat au moment où il se penche sur la soupe. Pendant plus d'une heure, les bombes tombent sur l'usine de Buna ; une bombe, tombée près de la place d'appel, n'explose pas. Les prisonniers, loin d'avoir peur, se réjouissent.</w:t>
+      </w:r>
+    </w:p>
+    <w:p>
+      <w:pPr>
+        <w:spacing w:after="120"/>
+        <w:ind w:firstLine="340"/>
+        <w:jc w:val="both"/>
+      </w:pPr>
+      <w:r>
+        <w:t xml:space="preserve">Une semaine plus tard, une potence noire se dresse sur la place d'appel. Un jeune homme de Varsovie est pendu pour avoir volé pendant l'alerte. Il meurt en acclamant la liberté et en maudissant l'Allemagne. Les détenus doivent défiler devant le corps. Ce soir-là, Eliezer trouve la soupe excellente.</w:t>
+      </w:r>
+    </w:p>
+    <w:p>
+      <w:pPr>
+        <w:spacing w:after="120"/>
+        <w:ind w:firstLine="340"/>
+        <w:jc w:val="both"/>
+      </w:pPr>
+      <w:r>
+        <w:t xml:space="preserve">Plus tard, après le sabotage de la centrale électrique de Buna et la découverte d'armes, un Oberkapo néerlandais est torturé pendant des semaines sans livrer un nom, puis envoyé à Auschwitz. Son pipel, un petit garçon au visage d'ange malheureux, aimé de tous, se tait lui aussi sous la torture. Il est conduit à la potence avec deux adultes. Le Lagerkapo refuse de servir de bourreau ; trois SS le remplacent. Les deux hommes acclament la liberté ; l'enfant se tait. Les adultes meurent aussitôt, mais l'enfant, trop léger, agonise plus d'une demi-heure, tandis que les prisonniers défilent devant lui. Derrière Eliezer, un homme demande : « Où est le bon Dieu, où est-il ? » En lui-même, Eliezer entend une voix répondre que Dieu est là, pendu à cette potence. Ce soir-là, la soupe a un goût de cadavre.</w:t>
+      </w:r>
+    </w:p>
+    <w:p>
+      <w:pPr>
+        <w:spacing w:after="120"/>
+        <w:ind w:firstLine="340"/>
+        <w:jc w:val="both"/>
+      </w:pPr>
+      <w:r>
+        <w:t xml:space="preserve">Avec la mort de cet enfant, c'est la foi d'Eliezer qui chancelle, comme si Dieu lui-même avait été exécuté avec l'innocence.</w:t>
       </w:r>
     </w:p>
     <w:p>
@@ -702,55 +804,55 @@
         <w:jc w:val="both"/>
       </w:pPr>
       <w:r>
-        <w:t xml:space="preserve">L'été s'achève à Buna et arrive Roch Hachana, le Nouvel An juif. Le soir de la fête, des milliers de détenus se rassemblent sur la place d'appel pour prier ensemble. Eliezer, lui, reste muet. Pourquoi louer un Dieu qui laisse brûler les fours crématoires, qui se tait devant les enfants jetés dans les flammes ? Au milieu de cette foule en prière, le garçon de quinze ans renverse les rôles du jour du Jugement : ce n'est plus l'homme qui comparaît devant Dieu, c'est Dieu qui est mis en accusation. « J'étais l'accusateur », affirme-t-il, et il se sent étrangement fort, seul, terriblement seul, comme vidé de toute espérance. L'office fini, il retrouve son père et lui baise la main ; une larme tombe entre eux, et ce geste muet dit mieux que des mots leur proximité dans la détresse.</w:t>
-      </w:r>
-    </w:p>
-    <w:p>
-      <w:pPr>
-        <w:spacing w:after="120"/>
-        <w:ind w:firstLine="340"/>
-        <w:jc w:val="both"/>
-      </w:pPr>
-      <w:r>
-        <w:t xml:space="preserve">Quelques jours plus tard vient Yom Kippour, le jour du Grand Pardon, où l'on jeûne. Les déportés se demandent s'il faut jeûner malgré la faim qui les ronge. Le père d'Eliezer le lui interdit, et le fils obéit volontiers : il avale sa ration de soupe comme un acte de révolte contre Dieu. Pourtant, ce défi ne lui procure aucune joie ; il ressent au fond de lui un grand vide. La perte de la foi n'est pas une libération, mais une blessure de plus.</w:t>
-      </w:r>
-    </w:p>
-    <w:p>
-      <w:pPr>
-        <w:pStyle w:val="Heading3"/>
-      </w:pPr>
-      <w:r>
-        <w:t xml:space="preserve">La sélection</w:t>
-      </w:r>
-    </w:p>
-    <w:p>
-      <w:pPr>
-        <w:spacing w:after="120"/>
-        <w:ind w:firstLine="340"/>
-        <w:jc w:val="both"/>
-      </w:pPr>
-      <w:r>
-        <w:t xml:space="preserve">Peu après, Eliezer est transféré dans un kommando de construction, séparé de son père, et doit charrier des pierres. Puis les SS offrent au camp leur « cadeau » de Nouvel An : une sélection. Les anciens conseillent de courir vite et d'avoir l'air vigoureux devant les médecins. Les détenus, nus, défilent au pas de course devant le docteur Mengele, celui-là même qui accueillait les convois à Birkenau, et qui note les numéros de ceux qu'il condamne. Eliezer court sans regarder, angoissé à l'idée que son matricule ait été inscrit. Ses camarades le rassurent : il est allé trop vite pour qu'on puisse le noter. Il est épargné, mais d'autres, qui savent leur sort scellé, pleurent en silence.</w:t>
-      </w:r>
-    </w:p>
-    <w:p>
-      <w:pPr>
-        <w:spacing w:after="120"/>
-        <w:ind w:firstLine="340"/>
-        <w:jc w:val="both"/>
-      </w:pPr>
-      <w:r>
-        <w:t xml:space="preserve">Le père d'Eliezer doit passer une seconde vérification. Le matin, avant le départ au travail, il tend à son fils un couteau et une cuillère : c'est tout ce qu'il possède, son héritage. Ce testament dérisoire marque un tournant : le père protecteur se prépare à disparaître. Toute la journée, Eliezer travaille sans savoir. Le soir, au retour, son père est toujours là, sauvé lui aussi, et le fils lui rend ses objets.</w:t>
-      </w:r>
-    </w:p>
-    <w:p>
-      <w:pPr>
-        <w:spacing w:after="120"/>
-        <w:ind w:firstLine="340"/>
-        <w:jc w:val="both"/>
-      </w:pPr>
-      <w:r>
-        <w:t xml:space="preserve">Tous n'ont pas cette chance. Akiba Drumer, dont la voix et la foi soutenaient les autres, cesse de croire et de lutter ; sans foi, il n'a plus de raison de vivre et se laisse prendre par la sélection. Avant de partir, il demande à ses compagnons de dire pour lui le </w:t>
+        <w:t xml:space="preserve">L'été s'achève à Buna et, avec lui, l'année juive. La veille de Roch Hachana, le Nouvel An juif, le camp est fébrile. Le soir, personne ne touche à la soupe : on attend d'avoir prié. Des milliers de détenus se rassemblent sur la place d'appel pour l'office. Eliezer, lui, se révolte : pourquoi bénir un Dieu qui fait brûler des enfants et laisse les crématoires fonctionner jour et nuit, même les jours de fête ? Ce jour où les hommes devraient comparaître devant Dieu, c'est lui qui L'accuse. « J'étais l'accusateur », dit-il : il se sent très fort, mais terriblement seul au monde. Après l'office, il retrouve son père, voûté contre un mur, et lui baise la main. Une larme y tombe, sans qu'il sache si elle vient de lui ou de son père. Jamais ils ne se sont aussi bien compris.</w:t>
+      </w:r>
+    </w:p>
+    <w:p>
+      <w:pPr>
+        <w:spacing w:after="120"/>
+        <w:ind w:firstLine="340"/>
+        <w:jc w:val="both"/>
+      </w:pPr>
+      <w:r>
+        <w:t xml:space="preserve">Vient ensuite Yom Kippour, le Grand Pardon, jour de jeûne. Les détenus en débattent : jeûner, ici, c'est hâter sa mort. Beaucoup jeûnent pourtant. Eliezer, lui, mange : d'abord parce que son père le lui a défendu, ensuite parce qu'il n'accepte plus le silence de Dieu. Avaler sa soupe devient un acte de révolte et de protestation. Mais au fond de son cœur, il ne ressent qu'un grand vide.</w:t>
+      </w:r>
+    </w:p>
+    <w:p>
+      <w:pPr>
+        <w:pStyle w:val="Heading3"/>
+      </w:pPr>
+      <w:r>
+        <w:t xml:space="preserve">Les sélections</w:t>
+      </w:r>
+    </w:p>
+    <w:p>
+      <w:pPr>
+        <w:spacing w:after="120"/>
+        <w:ind w:firstLine="340"/>
+        <w:jc w:val="both"/>
+      </w:pPr>
+      <w:r>
+        <w:t xml:space="preserve">Eliezer est ensuite transféré, sans son père, dans le kommando du bâtiment, où il traîne de lourds blocs de pierre. C'est alors que les SS offrent au camp leur « cadeau » de Nouvel An : une sélection. Le chef du block d'Eliezer, un vétéran qui n'a pas quitté les camps depuis 1933, conseille de ne pas avoir peur et de courir d'un pas ferme. Nus, les détenus défilent au pas de course devant le docteur Mengele, celui-là même qui les avait accueillis à Birkenau ; il note les numéros des condamnés. Eliezer court sans regarder, puis se demande avec angoisse si son matricule a été inscrit ; ses amis Yossi et Tibi le rassurent : il est passé trop vite. D'autres, qui se savent perdus, pleurent en silence. Eliezer court retrouver son père : lui aussi a passé.</w:t>
+      </w:r>
+    </w:p>
+    <w:p>
+      <w:pPr>
+        <w:spacing w:after="120"/>
+        <w:ind w:firstLine="340"/>
+        <w:jc w:val="both"/>
+      </w:pPr>
+      <w:r>
+        <w:t xml:space="preserve">Quelques jours plus tard, un matin, on lit une liste de numéros : ces hommes doivent rester au camp pour une seconde sélection, et le père d'Eliezer en fait partie. Avant que son fils parte au travail, il lui donne un couteau et une cuillère, tout ce qu'il possède : c'est son héritage. Eliezer travaille toute la journée dans l'angoisse. Le soir, il court au block : son père est là, il a passé la seconde sélection. Eliezer lui rend le couteau et la cuillère.</w:t>
+      </w:r>
+    </w:p>
+    <w:p>
+      <w:pPr>
+        <w:spacing w:after="120"/>
+        <w:ind w:firstLine="340"/>
+        <w:jc w:val="both"/>
+      </w:pPr>
+      <w:r>
+        <w:t xml:space="preserve">Akiba Drumer, lui, n'a pas échappé à la sélection. Depuis quelque temps, il errait les yeux vitreux, répétant à chacun qu'il n'en pouvait plus : dès que sa foi s'est fissurée, il a perdu toute raison de lutter. Avant d'être emmené, il demande à ses compagnons de dire pour lui le </w:t>
       </w:r>
       <w:r>
         <w:rPr>
@@ -760,7 +862,7 @@
         <w:t xml:space="preserve">Kaddish</w:t>
       </w:r>
       <w:r>
-        <w:t xml:space="preserve">, la prière des morts, trois jours plus tard. Ils le promettent, puis l'oublient, absorbés par la lutte quotidienne pour un morceau de pain. Cet oubli montre combien le camp réduit les hommes à l'instinct de survie.</w:t>
+        <w:t xml:space="preserve">, la prière des morts, dans trois jours. Ils le promettent. Trois jours plus tard, ils ont oublié.</w:t>
       </w:r>
     </w:p>
     <w:p>
@@ -778,27 +880,27 @@
         <w:jc w:val="both"/>
       </w:pPr>
       <w:r>
-        <w:t xml:space="preserve">L'hiver s'installe, glacial. Les détenus, vêtus de leurs minces tenues rayées, travaillent dans la neige. En janvier 1945, le pied droit d'Eliezer enfle à cause du froid. Un médecin, détenu juif lui aussi, juge qu'il faut opérer la plante du pied, rempli de pus, faute de quoi il faudrait amputer. L'opération réussit, et Eliezer doit rester deux semaines au repos. À l'infirmerie, la vie paraît presque douce : des draps, une soupe plus épaisse. Son voisin de lit, un Juif hongrois rongé par la dysenterie et réduit à la peau et aux os, le met en garde contre les sélections qui frappent aussi les malades. Quand Eliezer espère que la guerre finira avant, l'homme lui répond avec amertume que Hitler est le seul à avoir tenu toutes ses promesses envers les Juifs.</w:t>
-      </w:r>
-    </w:p>
-    <w:p>
-      <w:pPr>
-        <w:spacing w:after="120"/>
-        <w:ind w:firstLine="340"/>
-        <w:jc w:val="both"/>
-      </w:pPr>
-      <w:r>
-        <w:t xml:space="preserve">Bientôt, le grondement du canon se rapproche : l'Armée rouge avance, et les SS décident d'évacuer Buna. Les malades peuvent rester à l'infirmerie. Mais Eliezer, persuadé que les nazis achèveront les invalides avant l'arrivée des Russes, décide avec son père de partir avec les autres. Le narrateur révèle alors qu'après la guerre, il a appris le sort de ceux qui étaient restés : ils ont tout simplement été libérés par les Russes deux jours après l'évacuation. Cette ironie cruelle souligne l'absurdité d'un monde où le choix le plus raisonnable peut se révéler fatal.</w:t>
-      </w:r>
-    </w:p>
-    <w:p>
-      <w:pPr>
-        <w:spacing w:after="120"/>
-        <w:ind w:firstLine="340"/>
-        <w:jc w:val="both"/>
-      </w:pPr>
-      <w:r>
-        <w:t xml:space="preserve">Eliezer quitte l'infirmerie en courant dans la neige, son pied encore sanglant, et rejoint son père au block. Avant le départ, le chef de block fait nettoyer la baraque, afin que les libérateurs sachent que des hommes, et non des bêtes, y ont vécu. Le 18 janvier 1945, à la nuit tombée, sous une neige épaisse, les portes du camp s'ouvrent et les colonnes de détenus s'enfoncent dans la nuit. Une marche de la mort commence.</w:t>
+        <w:t xml:space="preserve">L'hiver arrive, terrible pour les détenus en minces tenues rayées. À Noël et au Nouvel An, on ne travaille pas, et la soupe est un peu moins claire. À la mi-janvier, le pied droit d'Eliezer enfle à cause du froid. Un médecin, détenu juif comme lui, décide de l'opérer, faute de quoi il faudrait amputer les orteils, peut-être la jambe. À l'infirmerie, Eliezer découvre des draps blancs, une soupe plus épaisse, ni appel ni travail. Son voisin, un Juif hongrois atteint de dysenterie, n'a plus que la peau sur les os ; il le prévient qu'il y a des sélections ici aussi, et plus souvent qu'ailleurs, car l'Allemagne n'a pas besoin de Juifs malades. L'opération réussit : à son réveil, Eliezer craint qu'on lui ait coupé la jambe, mais elle est là ; la plante du pied était pleine de pus, et il en a pour deux semaines de repos. Son voisin lui lance aussi, avec amertume, qu'il a plus confiance en Hitler qu'en personne, car Hitler est le seul à avoir tenu toutes ses promesses envers le peuple juif.</w:t>
+      </w:r>
+    </w:p>
+    <w:p>
+      <w:pPr>
+        <w:spacing w:after="120"/>
+        <w:ind w:firstLine="340"/>
+        <w:jc w:val="both"/>
+      </w:pPr>
+      <w:r>
+        <w:t xml:space="preserve">Deux jours après l'opération, la rumeur se répand : l'Armée rouge approche, on entend le canon, et les SS vont évacuer le camp. Les malades peuvent rester à l'infirmerie. Pour une fois, Eliezer et son père ont le choix : le père pourrait rester comme malade ou infirmier grâce au médecin, ou ils pourraient partir avec les autres. Persuadés que les nazis tueront les malades avant l'arrivée des Russes, ils décident de partir. Après la guerre, Eliezer apprendra que ceux qui étaient restés ont été tout simplement libérés par les Russes deux jours après l'évacuation.</w:t>
+      </w:r>
+    </w:p>
+    <w:p>
+      <w:pPr>
+        <w:spacing w:after="120"/>
+        <w:ind w:firstLine="340"/>
+        <w:jc w:val="both"/>
+      </w:pPr>
+      <w:r>
+        <w:t xml:space="preserve">Eliezer quitte l'infirmerie et court dans la neige, son pied à peine opéré saignant, pour rejoindre son père. Le chef de block fait nettoyer la baraque à fond, pour que les libérateurs sachent que là vivaient des hommes et non des bêtes. Puis, à la nuit tombée, sous la neige, les colonnes se forment et les portes du camp s'ouvrent : de l'autre côté semble les attendre une nuit plus noire encore.</w:t>
       </w:r>
     </w:p>
     <w:p>
@@ -816,57 +918,67 @@
         <w:jc w:val="both"/>
       </w:pPr>
       <w:r>
-        <w:t xml:space="preserve">La colonne quitte Buna en pleine nuit, sous un vent glacé et une neige qui ne cesse de tomber. Les SS exigent une allure toujours plus rapide, et la marche devient bientôt une course. Quiconque ralentit, trébuche ou s'arrête est abattu sur place ou piétiné par les milliers d'hommes qui suivent. Eliezer court avec son pied à peine opéré, porté par la masse, réduit à une machine qui avance sans penser. À ses côtés, le jeune Zalman, un Polonais qui travaillait avec lui au magasin, est pris de crampes au ventre ; il ne peut plus suivre, s'écarte, s'effondre, et disparaît sous les pieds de la foule.</w:t>
-      </w:r>
-    </w:p>
-    <w:p>
-      <w:pPr>
-        <w:spacing w:after="120"/>
-        <w:ind w:firstLine="340"/>
-        <w:jc w:val="both"/>
-      </w:pPr>
-      <w:r>
-        <w:t xml:space="preserve">La douleur et l'épuisement font naître chez Eliezer une tentation nouvelle, celle de la mort. Sortir du rang, se laisser tomber au bord de la route, en finir enfin : l'idée l'attire avec une force étrange. Seule la présence de son père, qui court près de lui, le retient. Il sait que sa disparition laisserait le vieil homme sans soutien, et cette responsabilité devient sa raison de continuer.</w:t>
-      </w:r>
-    </w:p>
-    <w:p>
-      <w:pPr>
-        <w:spacing w:after="120"/>
-        <w:ind w:firstLine="340"/>
-        <w:jc w:val="both"/>
-      </w:pPr>
-      <w:r>
-        <w:t xml:space="preserve">Après une course interminable, la colonne traverse un village abandonné et reçoit enfin l'autorisation de faire halte. Les déportés s'écroulent dans la neige, mais le repos est un piège mortel : s'endormir, c'est ne plus se réveiller. Eliezer et son père se réfugient dans un hangar à demi effondré et décident de veiller l'un sur l'autre, chacun réveillant l'autre à tour de rôle. Autour d'eux, beaucoup se couchent pour ne plus se relever, et la neige recouvre peu à peu les corps.</w:t>
-      </w:r>
-    </w:p>
-    <w:p>
-      <w:pPr>
-        <w:spacing w:after="120"/>
-        <w:ind w:firstLine="340"/>
-        <w:jc w:val="both"/>
-      </w:pPr>
-      <w:r>
-        <w:t xml:space="preserve">C'est là que surgit Rabbi Eliahou, vieil homme pieux et respecté, qui cherche son fils. Pendant trois ans, ils ne se sont jamais quittés dans les camps, et voici qu'il l'a perdu dans la cohue. Eliezer répond qu'il ne l'a pas vu. Mais, une fois le rabbin reparti, un souvenir lui revient : il a aperçu le fils courir devant, voir son père faiblir, et accélérer pour s'en éloigner. Il comprend que cet abandon était délibéré : le fils s'est débarrassé d'un fardeau qui menaçait sa propre survie. Bouleversé, Eliezer adresse alors une prière à ce Dieu en qui il ne croit plus : « Mon Dieu, Maître de l'Univers, donne-moi la force de ne jamais faire ce que le fils de Rabbi Eliahou a fait. » L'épisode annonce l'épreuve qui l'attend dans les chapitres suivants.</w:t>
-      </w:r>
-    </w:p>
-    <w:p>
-      <w:pPr>
-        <w:spacing w:after="120"/>
-        <w:ind w:firstLine="340"/>
-        <w:jc w:val="both"/>
-      </w:pPr>
-      <w:r>
-        <w:t xml:space="preserve">La marche reprend et s'achève à Gleiwitz. Aux portes des baraques, les détenus se ruent tous en même temps, s'écrasent. Eliezer, enseveli sous les corps, manque d'étouffer et doit se battre pour respirer. Sous lui, il découvre Juliek, le jeune violoniste de l'orchestre de Buna, qui s'inquiète surtout pour l'instrument qu'il a porté durant toute la marche. Au milieu de la nuit, dans ce tas de mourants, s'élève le son d'un violon : Juliek joue un fragment d'un concerto de Beethoven, musique qu'il était interdit aux Juifs de jouer. Ce concert dans les ténèbres, donné devant un public de morts et d'agonisants, apparaît comme un adieu et un ultime geste de liberté. Au matin, Eliezer retrouve Juliek mort, son violon piétiné et brisé à côté de lui.</w:t>
-      </w:r>
-    </w:p>
-    <w:p>
-      <w:pPr>
-        <w:spacing w:after="120"/>
-        <w:ind w:firstLine="340"/>
-        <w:jc w:val="both"/>
-      </w:pPr>
-      <w:r>
-        <w:t xml:space="preserve">Les prisonniers restent trois jours à Gleiwitz sans nourriture ni eau. Puis vient une nouvelle sélection : le père d'Eliezer est envoyé du côté des condamnés. Eliezer se précipite derrière lui et, profitant de la confusion, parvient à le ramener dans le bon groupe, tandis que des coups de feu éclatent. Fidèle à sa prière, il n'a pas lâché son père.</w:t>
+        <w:t xml:space="preserve">La colonne quitte Buna en pleine nuit, sous un vent glacé et une neige qui ne cesse de tomber. Les SS exigent une allure toujours plus rapide, et la marche devient bientôt une course. Quiconque ralentit, trébuche ou s'arrête est abattu sur place ou piétiné par les milliers d'hommes qui suivent. Eliezer court avec son pied à peine opéré, porté par la masse comme une machine. À ses côtés, le jeune Zalman, un Polonais qui travaillait avec lui au magasin de Buna, est pris de violentes crampes au ventre ; il ne peut plus suivre, s'arrête au bord du chemin, s'effondre et disparaît sous les pieds de la foule.</w:t>
+      </w:r>
+    </w:p>
+    <w:p>
+      <w:pPr>
+        <w:spacing w:after="120"/>
+        <w:ind w:firstLine="340"/>
+        <w:jc w:val="both"/>
+      </w:pPr>
+      <w:r>
+        <w:t xml:space="preserve">La douleur et l'épuisement font naître chez Eliezer une tentation nouvelle, celle de la mort. Se laisser tomber au bord de la route l'attire étrangement. Seule la présence de son père, qui court près de lui, le retient. Il ne veut pas le laisser seul.</w:t>
+      </w:r>
+    </w:p>
+    <w:p>
+      <w:pPr>
+        <w:spacing w:after="120"/>
+        <w:ind w:firstLine="340"/>
+        <w:jc w:val="both"/>
+      </w:pPr>
+      <w:r>
+        <w:t xml:space="preserve">Au petit jour, après des heures de course, la colonne traverse un village abandonné et reçoit enfin l'ordre de faire halte. Mais s'endormir dans le froid, c'est ne plus se réveiller. Eliezer et son père gagnent un hangar de briqueterie au toit défoncé et conviennent de veiller l'un sur l'autre ; quand son père s'assoupit, Eliezer le secoue pour le réveiller. Autour d'eux, beaucoup s'endorment pour ne plus se relever.</w:t>
+      </w:r>
+    </w:p>
+    <w:p>
+      <w:pPr>
+        <w:spacing w:after="120"/>
+        <w:ind w:firstLine="340"/>
+        <w:jc w:val="both"/>
+      </w:pPr>
+      <w:r>
+        <w:t xml:space="preserve">C'est là que surgit Rabbi Eliahou, vieil homme pieux, aimé de tous au camp, qui cherche son fils. Pendant trois ans, ils ne se sont jamais quittés, partageant les coups et la ration de pain, et voici qu'il l'a perdu pendant la marche. Eliezer répond qu'il ne l'a pas vu. Mais, une fois le rabbin reparti, un souvenir lui revient : il a aperçu le fils courir en tête de la colonne, voir son père faiblir, et continuer en creusant la distance. Le fils a voulu se débarrasser d'un père devenu un fardeau. Bouleversé, Eliezer adresse alors une prière à ce Dieu en qui il ne croit plus : « Mon Dieu, Maître de l'Univers, donne-moi la force de ne jamais faire ce que le fils de Rabbi Eliahou a fait. »</w:t>
+      </w:r>
+    </w:p>
+    <w:p>
+      <w:pPr>
+        <w:spacing w:after="120"/>
+        <w:ind w:firstLine="340"/>
+        <w:jc w:val="both"/>
+      </w:pPr>
+      <w:r>
+        <w:t xml:space="preserve">La marche reprend et, le soir, les survivants atteignent le camp de Gleiwitz. Aux portes des baraques, les détenus se ruent tous en même temps et s'écrasent dans l'obscurité. Eliezer, enseveli sous les corps, manque d'étouffer et doit se battre pour respirer. Tout près de lui, il découvre Juliek, le jeune violoniste polonais de l'orchestre de Buna, qui s'inquiète surtout pour l'instrument qu'il a porté durant toute la marche. Au milieu de la nuit, dans ce tas de vivants et de morts, s'élève le son d'un violon : Juliek joue un fragment d'un concerto de Beethoven, musique que les Juifs n'avaient pas le droit de jouer. Ce concert devant des agonisants sonne comme un adieu. Au matin, Eliezer retrouve Juliek mort, son violon piétiné et brisé à côté de lui. Depuis, il ne peut plus entendre Beethoven sans revoir cette nuit.</w:t>
+      </w:r>
+    </w:p>
+    <w:p>
+      <w:pPr>
+        <w:spacing w:after="120"/>
+        <w:ind w:firstLine="340"/>
+        <w:jc w:val="both"/>
+      </w:pPr>
+      <w:r>
+        <w:t xml:space="preserve">Les prisonniers restent trois jours à Gleiwitz, enfermés dans la baraque gardée par des SS, sans nourriture ni eau. On entend le canon du front russe, tout proche, mais la libération ne vient pas. Le troisième jour, tous sont rassemblés dans la cour pour une nouvelle sélection : un officier SS envoie les faibles à gauche, ceux qui marchent bien à droite. Le père d'Eliezer est envoyé à gauche, du côté des condamnés. Eliezer court derrière lui ; plusieurs SS se lancent à leur poursuite, et dans la confusion qui s'ensuit, un certain nombre de détenus repassent à droite, parmi eux Eliezer et son père. Des coups de feu éclatent et font quelques morts.</w:t>
+      </w:r>
+    </w:p>
+    <w:p>
+      <w:pPr>
+        <w:spacing w:after="120"/>
+        <w:ind w:firstLine="340"/>
+        <w:jc w:val="both"/>
+      </w:pPr>
+      <w:r>
+        <w:t xml:space="preserve">Les survivants sont ensuite conduits hors du camp, jusqu'à une voie ferrée au milieu d'un champ, où attend un long train de wagons à bestiaux découverts. Les SS les y font monter, une centaine d'hommes par wagon.</w:t>
       </w:r>
     </w:p>
     <w:p>
@@ -884,57 +996,67 @@
         <w:jc w:val="both"/>
       </w:pPr>
       <w:r>
-        <w:t xml:space="preserve">Entassés à une centaine par wagon dans des wagons à bestiaux sans toit, les déportés quittent Gleiwitz pour un voyage qui dure une dizaine de jours. La neige tombe sans relâche sur eux, se dépose sur les épaules et les couvertures, et c'est souvent tout ce qu'ils ont à boire ou à manger. Serrés les uns contre les autres, réduits à l'état de silhouettes immobiles, les hommes ne distinguent plus les vivants des morts. Eliezer lui-même sombre dans une indifférence totale, qui l'éloigne de tout, même de la peur de mourir.</w:t>
-      </w:r>
-    </w:p>
-    <w:p>
-      <w:pPr>
-        <w:spacing w:after="120"/>
-        <w:ind w:firstLine="340"/>
-        <w:jc w:val="both"/>
-      </w:pPr>
-      <w:r>
-        <w:t xml:space="preserve">Lors d'un arrêt en rase campagne, les SS ordonnent de jeter hors des wagons tous ceux qui ont cessé de vivre. Les survivants accueillent cet ordre presque avec soulagement, puisqu'il leur donnera un peu plus de place. On dépouille les cadavres de leurs vêtements avant de les précipiter dans la neige. Eliezer découvre alors son père inerte, les yeux clos, et le croit mort. Deux hommes s'approchent déjà pour l'emporter. Désespéré, il le frappe au visage, le gifle, l'appelle, jusqu'à ce que son père remue enfin les paupières. Le vieil homme est sauvé de justesse, mais l'épisode montre combien la frontière entre la vie et la mort est devenue mince.</w:t>
-      </w:r>
-    </w:p>
-    <w:p>
-      <w:pPr>
-        <w:spacing w:after="120"/>
-        <w:ind w:firstLine="340"/>
-        <w:jc w:val="both"/>
-      </w:pPr>
-      <w:r>
-        <w:t xml:space="preserve">Le train traverse ensuite des villes allemandes. Des ouvriers, amusés par le spectacle, lancent des morceaux de pain dans les wagons pour regarder les affamés se battre. Des dizaines d'hommes se jettent les uns sur les autres et se déchirent comme des bêtes. Eliezer assiste à une scène qui le hante : un vieillard parvient à cacher un bout de pain sous sa chemise, mais son propre fils, Meir, se rue sur lui et le roue de coups. Le père le supplie, rappelant que ce pain était aussi pour lui, puis meurt sous les coups. Le fils n'a pas le temps de manger sa part : d'autres se jettent sur lui et le tuent à son tour. Le père et le fils restent étendus côte à côte. La faim a détruit jusqu'au lien le plus sacré, et l'humanité elle-même semble avoir sombré.</w:t>
-      </w:r>
-    </w:p>
-    <w:p>
-      <w:pPr>
-        <w:spacing w:after="120"/>
-        <w:ind w:firstLine="340"/>
-        <w:jc w:val="both"/>
-      </w:pPr>
-      <w:r>
-        <w:t xml:space="preserve">Le narrateur interrompt alors son récit par un souvenir postérieur à la guerre : à Aden, des années plus tard, il a vu de riches passagers d'un paquebot jeter des pièces de monnaie aux enfants du port pour le plaisir de les voir se battre et plonger. Une Parisienne s'en amusait ; il l'a suppliée d'arrêter, et elle lui a répondu qu'elle aimait faire la charité. Le parallèle est accablant : le spectacle de la misère des autres peut divertir, même loin des camps, et l'indifférence n'a pas disparu avec la guerre.</w:t>
-      </w:r>
-    </w:p>
-    <w:p>
-      <w:pPr>
-        <w:spacing w:after="120"/>
-        <w:ind w:firstLine="340"/>
-        <w:jc w:val="both"/>
-      </w:pPr>
-      <w:r>
-        <w:t xml:space="preserve">Une nuit, un inconnu se jette sur Eliezer et tente de l'étrangler. Il parvient à appeler son père, qui demande de l'aide à Meir Katz, un ami robuste rencontré à Buna, l'homme le plus fort du wagon. Celui-ci arrache l'agresseur à l'adolescent et lui sauve la vie. Pourtant, même cet homme solide finit par craquer : il s'effondre en larmes et se demande pourquoi les Allemands ne les fusillent pas tous sur-le-champ.</w:t>
-      </w:r>
-    </w:p>
-    <w:p>
-      <w:pPr>
-        <w:spacing w:after="120"/>
-        <w:ind w:firstLine="340"/>
-        <w:jc w:val="both"/>
-      </w:pPr>
-      <w:r>
-        <w:t xml:space="preserve">Le dernier jour est le plus meurtrier. Un vent glacé balaie le wagon, et un cri monte bientôt de toutes les poitrines, comme une plainte collective venue d'au-delà de la vie. Quand le convoi atteint enfin Buchenwald, le bilan est effroyable : « Nous étions montés cent dans ce wagon. » Ils n'en descendent que douze, parmi lesquels Eliezer et son père. Meir Katz, lui, reste dans le wagon avec les morts.</w:t>
+        <w:t xml:space="preserve">Entassés à une centaine par wagon dans des wagons à bestiaux sans toit, les déportés quittent Gleiwitz pour un voyage qui dure dix jours et dix nuits. La neige tombe sans relâche sur eux et recouvre leurs couvertures ; faute de nourriture, ils la raclent sur le dos de leurs voisins pour la manger. Serrés les uns contre les autres, immobiles, les hommes ne distinguent plus les vivants des morts. Eliezer lui-même sombre dans une indifférence totale, au point que la mort ne lui fait plus peur.</w:t>
+      </w:r>
+    </w:p>
+    <w:p>
+      <w:pPr>
+        <w:spacing w:after="120"/>
+        <w:ind w:firstLine="340"/>
+        <w:jc w:val="both"/>
+      </w:pPr>
+      <w:r>
+        <w:t xml:space="preserve">Lors d'un arrêt en rase campagne, les SS ordonnent de jeter hors des wagons tous les morts. Les survivants s'en réjouissent presque, puisqu'ils auront un peu plus de place. On dépouille les cadavres de leurs vêtements, que les vivants se partagent, avant de les précipiter dans la neige. Eliezer découvre alors son père inerte, les yeux clos, et deux fossoyeurs s'apprêtent déjà à l'emporter. Désespéré, il se jette sur lui, le gifle, lui frotte les mains, l'appelle, jusqu'à ce que son père remue enfin les paupières et respire faiblement. Les deux hommes s'éloignent. Une vingtaine de cadavres sont jetés de leur wagon, et le train repart en laissant derrière lui des centaines de morts nus.</w:t>
+      </w:r>
+    </w:p>
+    <w:p>
+      <w:pPr>
+        <w:spacing w:after="120"/>
+        <w:ind w:firstLine="340"/>
+        <w:jc w:val="both"/>
+      </w:pPr>
+      <w:r>
+        <w:t xml:space="preserve">Le convoi traverse ensuite l'Allemagne. Un jour, à l'arrêt, un ouvrier allemand sort un morceau de pain de sa besace et le lance dans un wagon : des dizaines d'affamés se ruent dessus et s'entretuent pour quelques miettes, sous le regard intéressé de l'ouvrier. D'autres curieux l'imitent.</w:t>
+      </w:r>
+    </w:p>
+    <w:p>
+      <w:pPr>
+        <w:spacing w:after="120"/>
+        <w:ind w:firstLine="340"/>
+        <w:jc w:val="both"/>
+      </w:pPr>
+      <w:r>
+        <w:t xml:space="preserve">Le narrateur interrompt alors son récit par un souvenir d'après-guerre. Des années plus tard, à Aden, il a vu les passagers de son paquebot jeter des pièces de monnaie aux enfants du port, qui plongeaient pour les rattraper. Une Parisienne élégante s'en amusait beaucoup ; quand deux enfants se sont battus à mort pour une pièce, l'un essayant d'étrangler l'autre, il l'a suppliée d'arrêter. Elle lui a répondu qu'elle aimait faire la charité. Le rapprochement est accablant : la misère des autres peut divertir, même loin des camps.</w:t>
+      </w:r>
+    </w:p>
+    <w:p>
+      <w:pPr>
+        <w:spacing w:after="120"/>
+        <w:ind w:firstLine="340"/>
+        <w:jc w:val="both"/>
+      </w:pPr>
+      <w:r>
+        <w:t xml:space="preserve">De retour dans le wagon, Eliezer voit un vieil homme qui a réussi à sortir de la mêlée un bout de pain et le cache sous sa chemise. Mais son propre fils, Meir, se jette sur lui et le roue de coups. Le père le supplie de le reconnaître et lui rappelle que ce pain était aussi pour lui, puis meurt sous les coups. Le fils n'a pas le temps de manger : d'autres hommes se jettent sur lui et le tuent à son tour. Le père et le fils restent étendus côte à côte. La faim a détruit jusqu'au lien le plus sacré.</w:t>
+      </w:r>
+    </w:p>
+    <w:p>
+      <w:pPr>
+        <w:spacing w:after="120"/>
+        <w:ind w:firstLine="340"/>
+        <w:jc w:val="both"/>
+      </w:pPr>
+      <w:r>
+        <w:t xml:space="preserve">Une nuit, Eliezer se réveille avec un inconnu qui tente de l'étrangler. Il parvient à crier « Père ! ». Trop faible pour le défendre, celui-ci appelle à l'aide Meir Katz, le plus robuste d'entre eux, un ami de Buna qui y travaillait comme jardinier et leur apportait parfois des légumes. Meir Katz arrache l'agresseur à l'adolescent et lui sauve la vie. Pourtant, plus tard, même cet homme solide s'effondre : il avoue au père d'Eliezer qu'il n'en peut plus et demande pourquoi les Allemands ne les fusillent pas tous tout de suite.</w:t>
+      </w:r>
+    </w:p>
+    <w:p>
+      <w:pPr>
+        <w:spacing w:after="120"/>
+        <w:ind w:firstLine="340"/>
+        <w:jc w:val="both"/>
+      </w:pPr>
+      <w:r>
+        <w:t xml:space="preserve">Le dernier jour est le plus meurtrier. Après une nuit de vent glacial, un cri éclate, semblable à celui d'une bête blessée : quelqu'un vient de mourir. D'autres lui répondent, et bientôt toutes les poitrines poussent une plainte collective qui semble venir d'outre-tombe. Quand le convoi atteint enfin Buchenwald, le bilan est effroyable : ils étaient cent dans le wagon, ils ne sont plus que douze à en descendre, parmi lesquels Eliezer et son père. Meir Katz, lui, est resté dans le train.</w:t>
       </w:r>
     </w:p>
     <w:p>
@@ -952,67 +1074,67 @@
         <w:jc w:val="both"/>
       </w:pPr>
       <w:r>
-        <w:t xml:space="preserve">À Buchenwald, où le convoi parti de Gleiwitz vient d'arriver dans la nuit, les survivants sont rassemblés sur la place d'appel en attendant les douches. Le père d'Eliezer, à bout de forces, ne tient plus debout. Il se laisse tomber sur un tas de neige d'où dépassent déjà des corps immobiles et supplie son fils de le laisser se reposer un peu. Eliezer, qui sait que s'arrêter dans ce froid revient à mourir, s'emporte contre lui : il le secoue, le rudoie, lui parle avec une colère qui n'est que l'envers de sa peur. Mais son père ne répond plus que par des plaintes, comme un homme qui a déjà renoncé et qui ne cherche plus à comprendre.</w:t>
-      </w:r>
-    </w:p>
-    <w:p>
-      <w:pPr>
-        <w:spacing w:after="120"/>
-        <w:ind w:firstLine="340"/>
-        <w:jc w:val="both"/>
-      </w:pPr>
-      <w:r>
-        <w:t xml:space="preserve">Une alerte aérienne interrompt brutalement la scène. Les lumières s'éteignent, les gardes poussent tout le monde vers les blocs, et Eliezer, emporté par la foule, se retrouve seul. Épuisé, il s'endort sans chercher son père. À son réveil, en plein jour, il se souvient soudain de lui, et une pensée honteuse le traverse : il voudrait presque ne pas le retrouver, pour être enfin délivré de ce poids et ne lutter que pour lui-même. Aussitôt, il se reproche cette idée. Il finit par découvrir son père dans un autre bloc, brûlant de fièvre, et lui apporte un peu de café comme on apporterait un remède.</w:t>
-      </w:r>
-    </w:p>
-    <w:p>
-      <w:pPr>
-        <w:spacing w:after="120"/>
-        <w:ind w:firstLine="340"/>
-        <w:jc w:val="both"/>
-      </w:pPr>
-      <w:r>
-        <w:t xml:space="preserve">Le père est atteint de dysenterie. Il reste couché sur sa paillasse, de plus en plus faible, et l'infirmerie refuse de le soigner. Il ne cesse de réclamer de l'eau, alors que les autres détenus savent qu'elle aggrave son mal. Ses voisins de châlit, eux-mêmes réduits à l'état de bêtes affamées, le frappent parce qu'il souille sa couche et lui volent son pain. Eliezer, impuissant, assiste à cette lente agonie et partage avec lui la soupe et le pain qu'il parvient à garder.</w:t>
-      </w:r>
-    </w:p>
-    <w:p>
-      <w:pPr>
-        <w:spacing w:after="120"/>
-        <w:ind w:firstLine="340"/>
-        <w:jc w:val="both"/>
-      </w:pPr>
-      <w:r>
-        <w:t xml:space="preserve">C'est alors qu'intervient le chef de bloc. Prenant Eliezer à part, il lui tient un discours d'une froide lucidité : dans ce camp, personne ne doit penser à personne, pas même à son propre père, et chaque ration donnée à un mourant est une ration perdue pour celui qui pourrait encore survivre. Il lui conseille donc de manger lui-même sa part. Le plus terrible est qu'Eliezer, au fond de lui, reconnaît la logique de ce raisonnement et n'ose pas se l'avouer. Il ne suit pas le conseil, il continue de nourrir son père, mais la seule tentation suffit à le remplir de honte. Le camp a réussi à introduire en lui le poison de l'égoïsme, et c'est cette faute intérieure, plus que tout acte, qui le hantera.</w:t>
-      </w:r>
-    </w:p>
-    <w:p>
-      <w:pPr>
-        <w:spacing w:after="120"/>
-        <w:ind w:firstLine="340"/>
-        <w:jc w:val="both"/>
-      </w:pPr>
-      <w:r>
-        <w:t xml:space="preserve">Le 28 janvier 1945, le père gémit et demande encore à boire. Un officier SS, excédé, lui ordonne de se taire puis le frappe violemment à la tête avec sa matraque. Eliezer, couché sur la couchette du dessus, ne bouge pas : il a peur d'être frappé à son tour. Son père, le visage ensanglanté, prononce un dernier mot, qui est un appel : « Eliezer ». Le fils reste près de lui un long moment, à le regarder, avant de remonter sur sa couchette.</w:t>
-      </w:r>
-    </w:p>
-    <w:p>
-      <w:pPr>
-        <w:spacing w:after="120"/>
-        <w:ind w:firstLine="340"/>
-        <w:jc w:val="both"/>
-      </w:pPr>
-      <w:r>
-        <w:t xml:space="preserve">Le lendemain, 29 janvier, Eliezer se réveille à l'aube : sur le lit de son père se trouve désormais un autre malade. On l'a emmené avant le jour vers le crématoire, peut-être encore vivant. Il n'y a eu ni prière, ni bougie allumée en sa mémoire. Eliezer constate qu'il ne peut pas pleurer ; ses larmes semblent taries. Pire encore, il devine au fond de sa conscience affaiblie quelque chose qui ressemble à un soulagement, à l'impression d'être enfin libéré.</w:t>
-      </w:r>
-    </w:p>
-    <w:p>
-      <w:pPr>
-        <w:spacing w:after="120"/>
-        <w:ind w:firstLine="340"/>
-        <w:jc w:val="both"/>
-      </w:pPr>
-      <w:r>
-        <w:t xml:space="preserve">Ce chapitre, le plus douloureux du récit, montre un amour filial qui résiste jusqu'au bout mais que la faim, la peur et l'épuisement ont rongé : la culpabilité d'Eliezer est le fruit d'un système conçu pour détruire jusqu'à la compassion.</w:t>
+        <w:t xml:space="preserve">À Buchenwald, où le train arrive dans la nuit, des SS comptent les déportés et les dirigent vers la place d'appel. Eliezer serre la main de son père : il ne faut pas le perdre. On leur annonce qu'ils iront bientôt aux douches chaudes. Le père, épuisé, n'en peut plus. Il s'éloigne vers un tas de neige d'où dépassent des formes humaines et supplie son fils de le laisser se reposer là. Eliezer s'emporte, lui montre les cadavres qui ont eux aussi voulu se reposer, mais son père répond doucement qu'il les voit et qu'il faut les laisser dormir. Eliezer comprend qu'il ne discute plus avec son père, mais avec la mort qu'il a déjà choisie.</w:t>
+      </w:r>
+    </w:p>
+    <w:p>
+      <w:pPr>
+        <w:spacing w:after="120"/>
+        <w:ind w:firstLine="340"/>
+        <w:jc w:val="both"/>
+      </w:pPr>
+      <w:r>
+        <w:t xml:space="preserve">Une alerte aérienne interrompt la scène : les lumières s'éteignent, les gardes chassent tout le monde vers les blocs. Eliezer, heureux d'échapper au froid, suit la masse sans s'occuper de son père et s'endort. Il se réveille au jour et se souvient alors qu'il a un père. En le cherchant, une pensée le traverse : s'il pouvait ne pas le retrouver, être débarrassé de ce poids pour ne lutter que pour sa propre survie. Aussitôt, il en a honte pour toute sa vie. Il finit par le découvrir dans un autre bloc, livide, grelottant, couché sur une planche. Le père lui demande un peu de café ; Eliezer se bat dans la cohue pour lui en rapporter une tasse, que le vieil homme boit avec une gratitude de bête blessée.</w:t>
+      </w:r>
+    </w:p>
+    <w:p>
+      <w:pPr>
+        <w:spacing w:after="120"/>
+        <w:ind w:firstLine="340"/>
+        <w:jc w:val="both"/>
+      </w:pPr>
+      <w:r>
+        <w:t xml:space="preserve">Seuls les malades peuvent rester dans le bloc pendant le nettoyage ; Eliezer doit passer de longues heures dehors. À son retour, son père lui apprend qu'on ne leur a rien donné à manger : puisque les malades vont mourir, il serait dommage de gaspiller la nourriture. Eliezer lui donne le reste de sa soupe, mais à contrecœur, et il sent qu'il n'a pas mieux réussi l'épreuve que le fils de Rabbi Eliahou.</w:t>
+      </w:r>
+    </w:p>
+    <w:p>
+      <w:pPr>
+        <w:spacing w:after="120"/>
+        <w:ind w:firstLine="340"/>
+        <w:jc w:val="both"/>
+      </w:pPr>
+      <w:r>
+        <w:t xml:space="preserve">Le père a la dysenterie. Il s'affaiblit, réclame sans cesse de l'eau alors qu'on lui répète que c'est ce qu'il y a de pire pour lui. Eliezer va chercher le médecin, qui refuse de faire quoi que ce soit. Ses voisins de châlit le frappent et lui prennent son pain ; il s'en plaint à son fils, qui reste impuissant. Sentant venir la fin, le père se hâte de lui confier où il a enterré l'or et l'argent dans la cave, à Sighet.</w:t>
+      </w:r>
+    </w:p>
+    <w:p>
+      <w:pPr>
+        <w:spacing w:after="120"/>
+        <w:ind w:firstLine="340"/>
+        <w:jc w:val="both"/>
+      </w:pPr>
+      <w:r>
+        <w:t xml:space="preserve">Au bout d'une semaine, le chef de bloc prend Eliezer à part : dans un camp de concentration, chacun doit lutter pour soi et ne penser à personne, pas même à son père. Il lui conseille de ne plus donner sa ration au vieil homme, qu'il ne peut plus sauver, et même de prendre la sienne. Eliezer pense, au plus secret de lui-même, qu'il a raison : il pourrait avoir deux rations de pain et de soupe. Une fraction de seconde seulement, mais il se sent coupable et court chercher de la soupe chaude pour son père, qui ne veut plus que de l'eau.</w:t>
+      </w:r>
+    </w:p>
+    <w:p>
+      <w:pPr>
+        <w:spacing w:after="120"/>
+        <w:ind w:firstLine="340"/>
+        <w:jc w:val="both"/>
+      </w:pPr>
+      <w:r>
+        <w:t xml:space="preserve">Le soir du 28 janvier 1945, Eliezer est couché sur la couchette au-dessus de celle de son père. Celui-ci gémit, appelle son fils, demande à boire. Un officier SS lui ordonne de se taire, puis lui assène un violent coup de matraque sur la tête. Eliezer ne bouge pas : son corps a peur d'être frappé à son tour. Son père râle encore, et son dernier mot est le nom de son fils : « Eliezer ». Après l'appel, Eliezer descend et reste plus d'une heure penché sur lui, à graver en lui ce visage ensanglanté, cette tête fracassée, puis il remonte se coucher au-dessus de son père qui vit encore.</w:t>
+      </w:r>
+    </w:p>
+    <w:p>
+      <w:pPr>
+        <w:spacing w:after="120"/>
+        <w:ind w:firstLine="340"/>
+        <w:jc w:val="both"/>
+      </w:pPr>
+      <w:r>
+        <w:t xml:space="preserve">Le 29 janvier, à l'aube, un autre malade occupe la place de son père. On l'a emporté au crématoire avant le jour, peut-être encore vivant. Il n'y a eu ni prière sur sa tombe, ni bougie allumée à sa mémoire. Son dernier mot était un appel, et Eliezer n'y a pas répondu. Il ne pleure pas, et souffre de ne pas pouvoir pleurer : il n'a plus de larmes. Au fond de sa conscience affaiblie, il trouverait peut-être quelque chose comme : enfin libre. Le camp a rongé jusqu'à l'amour filial.</w:t>
       </w:r>
     </w:p>
     <w:p>
@@ -1030,47 +1152,57 @@
         <w:jc w:val="both"/>
       </w:pPr>
       <w:r>
-        <w:t xml:space="preserve">Après la mort de son père, à la fin janvier 1945, Eliezer reste à Buchenwald jusqu'au 11 avril. Il refuse presque de raconter ces semaines : plus rien ne le touche. Transféré au bloc des enfants, où se trouvent environ six cents garçons, il ne pense plus à son père, ni même à sa mère, et ne rêve que d'un supplément de soupe.</w:t>
-      </w:r>
-    </w:p>
-    <w:p>
-      <w:pPr>
-        <w:spacing w:after="120"/>
-        <w:ind w:firstLine="340"/>
-        <w:jc w:val="both"/>
-      </w:pPr>
-      <w:r>
-        <w:t xml:space="preserve">Le front se rapproche. Le 5 avril, les haut-parleurs ordonnent à tous les Juifs de se rendre sur la place d'appel ; des membres de la résistance clandestine du camp renvoient les enfants dans leur bloc, car les Allemands veulent liquider les détenus juifs. Les jours suivants, les SS annoncent la liquidation du camp et évacuent chaque jour des milliers de prisonniers, qui ne reviennent pas.</w:t>
-      </w:r>
-    </w:p>
-    <w:p>
-      <w:pPr>
-        <w:spacing w:after="120"/>
-        <w:ind w:firstLine="340"/>
-        <w:jc w:val="both"/>
-      </w:pPr>
-      <w:r>
-        <w:t xml:space="preserve">Le 10 avril, quelque vingt mille détenus, dont quelques centaines d'enfants, demeurent encore à Buchenwald. Les SS décident de les évacuer tous en une seule fois et de faire ensuite sauter le camp. Rassemblés sur la place d'appel, les prisonniers sont sauvés de justesse par une alerte aérienne qui fait reporter l'évacuation au lendemain. Le 11 avril, alors que les SS commencent à pousser les derniers détenus vers la sortie, la résistance armée du camp passe à l'action : après de brefs combats, les SS s'enfuient et les insurgés prennent le contrôle de Buchenwald. Vers six heures du soir, le premier char américain se présente aux portes du camp.</w:t>
-      </w:r>
-    </w:p>
-    <w:p>
-      <w:pPr>
-        <w:spacing w:after="120"/>
-        <w:ind w:firstLine="340"/>
-        <w:jc w:val="both"/>
-      </w:pPr>
-      <w:r>
-        <w:t xml:space="preserve">Le premier geste des hommes libérés est de se jeter sur les vivres ; ils ne pensent ni à se venger ni à leurs familles, mais seulement au pain. Même le lendemain, rapporte le narrateur, quelques jeunes gens partent à Weimar chercher des vêtements et des pommes de terre, et coucher avec des filles, mais de vengeance, pas trace. Ce détail dit à quel point la faim a tout recouvert : la liberté arrive trop tard pour que la joie ou la colère puissent encore s'exprimer. Trois jours après la libération, Eliezer tombe gravement malade, victime d'une intoxication alimentaire, et passe deux semaines à l'hôpital, entre la vie et la mort.</w:t>
-      </w:r>
-    </w:p>
-    <w:p>
-      <w:pPr>
-        <w:spacing w:after="120"/>
-        <w:ind w:firstLine="340"/>
-        <w:jc w:val="both"/>
-      </w:pPr>
-      <w:r>
-        <w:t xml:space="preserve">Lorsqu'il parvient enfin à se lever, il se regarde dans un miroir pour la première fois depuis le ghetto. « Du fond du miroir, un cadavre me contemplait. » Ce regard, dit-il, ne l'a plus jamais quitté. L'image finale est saisissante : le corps a survécu, mais l'adolescent croyant de Sighet est mort dans les camps. Le livre ne s'achève pas sur la joie de la libération, mais sur une blessure qui ne se refermera pas.</w:t>
+        <w:t xml:space="preserve">Après la mort de son père, fin janvier 1945, Eliezer reste à Buchenwald jusqu'au 11 avril. Il refuse de raconter ces semaines : depuis cette mort, plus rien ne le touche. Transféré au bloc des enfants, où ils sont six cents, il passe ses journées dans une oisiveté totale, avec un seul désir, manger. Il ne pense plus ni à son père ni à sa mère ; quand il rêve, c'est d'un supplément de soupe.</w:t>
+      </w:r>
+    </w:p>
+    <w:p>
+      <w:pPr>
+        <w:spacing w:after="120"/>
+        <w:ind w:firstLine="340"/>
+        <w:jc w:val="both"/>
+      </w:pPr>
+      <w:r>
+        <w:t xml:space="preserve">Le front se rapproche. Le 5 avril, en fin d'après-midi, le SS chargé du dénombrement tarde à venir, fait jamais vu. Puis les haut-parleurs ordonnent à tous les Juifs de se rendre sur la place d'appel ; Eliezer croit que c'est la fin. En chemin, des prisonniers chuchotent aux enfants de retourner à leur bloc, car les Allemands veulent les fusiller : la résistance du camp a décidé d'empêcher la liquidation des Juifs. Le lendemain, lors d'un appel général, le chef du camp annonce que Buchenwald sera liquidé, dix blocs par jour. Plus de pain ni de soupe. Chaque jour, quelques milliers de détenus franchissent la porte et ne reviennent pas.</w:t>
+      </w:r>
+    </w:p>
+    <w:p>
+      <w:pPr>
+        <w:spacing w:after="120"/>
+        <w:ind w:firstLine="340"/>
+        <w:jc w:val="both"/>
+      </w:pPr>
+      <w:r>
+        <w:t xml:space="preserve">Le 10 avril, il reste environ vingt mille détenus, dont quelques centaines d'enfants. Les SS décident de les évacuer tous en une fois, puis de faire sauter le camp. Massés sur la place d'appel, les prisonniers attendent l'ouverture de la porte quand les sirènes annoncent une alerte : on regagne les blocs et l'évacuation est reportée au lendemain. Depuis six jours, ils n'ont mangé qu'un peu d'herbe et des épluchures de pommes de terre.</w:t>
+      </w:r>
+    </w:p>
+    <w:p>
+      <w:pPr>
+        <w:spacing w:after="120"/>
+        <w:ind w:firstLine="340"/>
+        <w:jc w:val="both"/>
+      </w:pPr>
+      <w:r>
+        <w:t xml:space="preserve">Le 11 avril, à dix heures du matin, les SS se répandent dans le camp pour pousser les derniers détenus vers la place. La résistance passe alors à l'action : rafales et grenades éclatent, et les enfants restent couchés à plat ventre dans leur bloc. Vers midi, tout est calme : les SS ont fui et les résistants dirigent le camp. À six heures, le premier char américain se présente aux portes de Buchenwald.</w:t>
+      </w:r>
+    </w:p>
+    <w:p>
+      <w:pPr>
+        <w:spacing w:after="120"/>
+        <w:ind w:firstLine="340"/>
+        <w:jc w:val="both"/>
+      </w:pPr>
+      <w:r>
+        <w:t xml:space="preserve">Le premier geste des hommes libres est de se jeter sur le ravitaillement : ils ne pensent ni à la vengeance ni à leurs parents, seulement au pain. Le lendemain, quelques jeunes gens courent à Weimar chercher pommes de terre et habits, et coucher avec des filles, mais personne ne songe à se venger. Trois jours après la libération, Eliezer, empoisonné, passe deux semaines à l'hôpital entre la vie et la mort.</w:t>
+      </w:r>
+    </w:p>
+    <w:p>
+      <w:pPr>
+        <w:spacing w:after="120"/>
+        <w:ind w:firstLine="340"/>
+        <w:jc w:val="both"/>
+      </w:pPr>
+      <w:r>
+        <w:t xml:space="preserve">Un jour, rassemblant ses forces, il se lève pour se regarder dans le miroir accroché au mur d'en face : il ne s'est plus vu depuis le ghetto. « Du fond du miroir, un cadavre me contemplait. » Ce regard, écrit-il, ne le quitte plus. Le livre s'achève non sur la joie de la libération, mais sur un survivant qui se voit déjà mort.</w:t>
       </w:r>
     </w:p>
     <w:p>
@@ -1088,7 +1220,7 @@
         <w:jc w:val="both"/>
       </w:pPr>
       <w:r>
-        <w:t xml:space="preserve">En un peu plus d'un an, de mai 1944 à avril 1945, Eliezer a tout perdu : sa mère et sa petite sœur dès la première nuit, son père trois mois avant la libération, sa foi d'enfant au fil des sélections et des pendaisons, et jusqu'à l'image qu'il avait de lui-même. Le livre suit une trajectoire implacable, de la maison d'étude de Sighet au miroir de Buchenwald : à chaque étape, un lien se défait, avec la communauté, avec Dieu, avec le père, avec le corps. Mais le simple fait que ce récit existe renverse cette chute : l'adolescent qui ne voyait plus qu'un cadavre dans le miroir est devenu le témoin qui raconte, pour que la nuit qu'il a traversée ne retombe pas dans le silence.</w:t>
+        <w:t xml:space="preserve">En un peu moins d'un an, de mai 1944 à avril 1945, Eliezer a tout perdu : sa mère et sa petite sœur dès l'arrivée à Birkenau, son père moins de trois mois avant la libération, sa foi d'enfant au fil des sélections et des pendaisons, et jusqu'à l'image qu'il avait de lui-même. Le livre suit une trajectoire implacable, de la maison d'étude de Sighet au miroir de Buchenwald : à chaque étape, un lien se défait, avec la communauté, avec Dieu, avec le père, avec le corps. Mais le simple fait que ce récit existe renverse cette chute : l'adolescent qui ne voyait plus qu'un cadavre dans le miroir est devenu le témoin qui raconte, pour que la nuit qu'il a traversée ne retombe pas dans le silence.</w:t>
       </w:r>
     </w:p>
     <w:p>
@@ -1137,7 +1269,7 @@
         <w:jc w:val="both"/>
       </w:pPr>
       <w:r>
-        <w:t xml:space="preserve">Eliezer Wiesel naît le 30 septembre 1928 à Sighet, petite ville de Transylvanie alors rattachée à la Roumanie. Fils de Shlomo, commerçant respecté, et de Sarah, il grandit avec ses sœurs Hilda, Béa et Tzipora dans la ferveur hassidique, ce qui éclaire la place de la foi blessée dans </w:t>
+        <w:t xml:space="preserve">Eliezer Wiesel naît le 30 septembre 1928 à Sighet, petite ville de Transylvanie alors roumaine, annexée par la Hongrie en 1940. Fils de Shlomo, commerçant respecté, et de Sarah, il grandit avec ses sœurs Hilda, Béa et Tzipora dans la ferveur hassidique et l'étude de la Torah et de la Kabbale, ce qui éclaire la place de la foi blessée dans </w:t>
       </w:r>
       <w:r>
         <w:rPr>
@@ -1157,7 +1289,7 @@
         <w:jc w:val="both"/>
       </w:pPr>
       <w:r>
-        <w:t xml:space="preserve">Déporté à Auschwitz en mai 1944, il y perd sa mère et Tzipora dès l'arrivée, puis son père à Buchenwald en janvier 1945 ; il est libéré le 11 avril 1945.</w:t>
+        <w:t xml:space="preserve">Au printemps 1944, les Juifs de Sighet sont enfermés dans un ghetto puis déportés à Auschwitz-Birkenau en mai. Elie, quinze ans, y perd dès l'arrivée sa mère et Tzipora. Avec son père, il passe par Buna, subit en janvier 1945 la marche de la mort puis le transfert vers Buchenwald, où Shlomo meurt fin janvier. Elie est libéré le 11 avril 1945.</w:t>
       </w:r>
     </w:p>
     <w:p>
@@ -1175,7 +1307,7 @@
         <w:jc w:val="both"/>
       </w:pPr>
       <w:r>
-        <w:t xml:space="preserve">Orphelin, il est accueilli en France par l'Œuvre de secours aux enfants (OSE), qui l'héberge dans plusieurs maisons d'enfants. Il y apprend le français, étudie à la Sorbonne et devient journaliste, notamment correspondant du quotidien israélien </w:t>
+        <w:t xml:space="preserve">Orphelin, il est accueilli en France par l'Œuvre de secours aux enfants (OSE). Il y apprend le français, étudie à la Sorbonne et devient journaliste, notamment pour le quotidien israélien </w:t>
       </w:r>
       <w:r>
         <w:rPr>
@@ -1185,7 +1317,7 @@
         <w:t xml:space="preserve">Yediot Aharonot</w:t>
       </w:r>
       <w:r>
-        <w:t xml:space="preserve">. Après dix ans de silence, il publie son témoignage, d'abord en yiddish (1956), puis en français, sous le titre </w:t>
+        <w:t xml:space="preserve">. Après dix ans de silence, il publie son témoignage, d'abord en yiddish (1956), puis, encouragé et préfacé par François Mauriac, en français : </w:t>
       </w:r>
       <w:r>
         <w:rPr>
@@ -1195,17 +1327,47 @@
         <w:t xml:space="preserve">La Nuit</w:t>
       </w:r>
       <w:r>
-        <w:t xml:space="preserve"> (1958), avec le soutien de François Mauriac.</w:t>
-      </w:r>
-    </w:p>
-    <w:p>
-      <w:pPr>
-        <w:spacing w:after="120"/>
-        <w:ind w:firstLine="340"/>
-        <w:jc w:val="both"/>
-      </w:pPr>
-      <w:r>
-        <w:t xml:space="preserve">Installé aux États-Unis à partir de 1956, Wiesel est naturalisé américain en 1963. Il écrit en français une œuvre abondante, dont </w:t>
+        <w:t xml:space="preserve"> (1958).</w:t>
+      </w:r>
+    </w:p>
+    <w:p>
+      <w:pPr>
+        <w:spacing w:after="120"/>
+        <w:ind w:firstLine="340"/>
+        <w:jc w:val="both"/>
+      </w:pPr>
+      <w:r>
+        <w:t xml:space="preserve">Installé à New York au milieu des années 1950, il est naturalisé américain en 1963. Il poursuit en français une œuvre abondante : </w:t>
+      </w:r>
+      <w:r>
+        <w:rPr>
+          <w:i/>
+          <w:iCs/>
+        </w:rPr>
+        <w:t xml:space="preserve">L'Aube</w:t>
+      </w:r>
+      <w:r>
+        <w:t xml:space="preserve"> et </w:t>
+      </w:r>
+      <w:r>
+        <w:rPr>
+          <w:i/>
+          <w:iCs/>
+        </w:rPr>
+        <w:t xml:space="preserve">Le Jour</w:t>
+      </w:r>
+      <w:r>
+        <w:t xml:space="preserve">, qui prolongent </w:t>
+      </w:r>
+      <w:r>
+        <w:rPr>
+          <w:i/>
+          <w:iCs/>
+        </w:rPr>
+        <w:t xml:space="preserve">La Nuit</w:t>
+      </w:r>
+      <w:r>
+        <w:t xml:space="preserve">, </w:t>
       </w:r>
       <w:r>
         <w:rPr>
@@ -1215,17 +1377,27 @@
         <w:t xml:space="preserve">Le Mendiant de Jérusalem</w:t>
       </w:r>
       <w:r>
-        <w:t xml:space="preserve">, prix Médicis 1968. À partir de 1976, il enseigne les humanités à l'université de Boston.</w:t>
-      </w:r>
-    </w:p>
-    <w:p>
-      <w:pPr>
-        <w:spacing w:after="120"/>
-        <w:ind w:firstLine="340"/>
-        <w:jc w:val="both"/>
-      </w:pPr>
-      <w:r>
-        <w:t xml:space="preserve">En 1978, le président Jimmy Carter le nomme à la tête de la Commission présidentielle sur l'Holocauste, dont les travaux conduisent à la création du musée-mémorial de l'Holocauste à Washington. En 1986, il reçoit le prix Nobel de la paix et crée avec son épouse Marion la Fondation Elie Wiesel pour l'humanité ; il défend les victimes de persécutions, du Cambodge à la Bosnie et au Darfour. Il meurt à New York le 2 juillet 2016. Toute sa vie illustre ainsi l'idée qui fonde </w:t>
+        <w:t xml:space="preserve">, prix Médicis 1968, puis ses mémoires, </w:t>
+      </w:r>
+      <w:r>
+        <w:rPr>
+          <w:i/>
+          <w:iCs/>
+        </w:rPr>
+        <w:t xml:space="preserve">Tous les fleuves vont à la mer</w:t>
+      </w:r>
+      <w:r>
+        <w:t xml:space="preserve">. À partir de 1976, il enseigne à l'université de Boston.</w:t>
+      </w:r>
+    </w:p>
+    <w:p>
+      <w:pPr>
+        <w:spacing w:after="120"/>
+        <w:ind w:firstLine="340"/>
+        <w:jc w:val="both"/>
+      </w:pPr>
+      <w:r>
+        <w:t xml:space="preserve">En 1978, le président Jimmy Carter le nomme à la tête de la Commission présidentielle sur l'Holocauste, dont les travaux conduisent au musée-mémorial de l'Holocauste de Washington, ouvert en 1993. En 1986, il reçoit le prix Nobel de la paix ; avec son épouse Marion, il fonde la Fondation Elie Wiesel pour l'humanité. Il défend les Juifs d'Union soviétique et les victimes de persécutions, du Cambodge à la Bosnie et au Darfour. Il meurt à New York le 2 juillet 2016. Toute sa vie prolonge l'idée qui fonde </w:t>
       </w:r>
       <w:r>
         <w:rPr>
@@ -1235,7 +1407,7 @@
         <w:t xml:space="preserve">La Nuit</w:t>
       </w:r>
       <w:r>
-        <w:t xml:space="preserve"> : témoigner, c'est empêcher les morts d'être tués une seconde fois par l'oubli.</w:t>
+        <w:t xml:space="preserve"> : témoigner, c'est refuser que l'oubli tue les morts une seconde fois.</w:t>
       </w:r>
     </w:p>
     <w:p>
@@ -1278,17 +1450,17 @@
         <w:jc w:val="both"/>
       </w:pPr>
       <w:r>
-        <w:t xml:space="preserve">Sighet se trouve dans les Carpates, en Transylvanie du Nord, région roumaine après 1918 et rattachée à la Hongrie en 1940 par le second arbitrage de Vienne. La Hongrie de l'amiral Horthy, alliée de l'Allemagne, persécute ses Juifs mais refuse longtemps de les livrer aux nazis. Elle expulse pourtant dès l'été 1941 des Juifs considérés comme étrangers, massacrés ensuite en Galicie et en Ukraine occupées : c'est le sort de Moshé le Bedeau, revenu seul pour raconter l'horreur. Personne ne le croit, et les habitants de Sighet, comme le jeune Eliezer, continuent de penser que la guerre les épargnera.</w:t>
-      </w:r>
-    </w:p>
-    <w:p>
-      <w:pPr>
-        <w:spacing w:after="120"/>
-        <w:ind w:firstLine="340"/>
-        <w:jc w:val="both"/>
-      </w:pPr>
-      <w:r>
-        <w:t xml:space="preserve">Tout bascule le 19 mars 1944, lorsque l'Allemagne occupe la Hongrie, qui cherchait à se retirer de la guerre. Adolf Eichmann arrive avec une petite équipe de spécialistes de la déportation, qui s'appuie sur l'administration et la gendarmerie hongroises. Étoile jaune, ghettos, puis déportation à un rythme sans précédent : de la mi-mai au début de juillet 1944, environ 437 000 personnes sont envoyées, en un peu moins de deux mois, vers Auschwitz-Birkenau, où la grande majorité est gazée dès l'arrivée. À Sighet, le ghetto est créé en avril et environ 13 000 Juifs sont déportés vers la mi-mai 1944. Le livre restitue fidèlement ces étapes.</w:t>
+        <w:t xml:space="preserve">Sighet se trouve dans les Carpates, en Transylvanie du Nord, région roumaine après 1918 et rattachée à la Hongrie en 1940 par le second arbitrage de Vienne. La Hongrie de l'amiral Horthy, alliée de l'Allemagne, multiplie les lois antijuives mais refuse longtemps de livrer ses Juifs aux nazis. Elle expulse pourtant dès l'été 1941 des Juifs considérés comme étrangers, massacrés ensuite en Galicie et en Ukraine occupée, notamment à Kamenets-Podolsk : c'est le sort de Moshé le Bedeau, revenu seul pour raconter l'horreur. Personne ne le croit. Mal informés, rassurés par l'avancée de l'Armée rouge, les habitants de Sighet, comme le jeune Eliezer, pensent que la guerre les épargnera.</w:t>
+      </w:r>
+    </w:p>
+    <w:p>
+      <w:pPr>
+        <w:spacing w:after="120"/>
+        <w:ind w:firstLine="340"/>
+        <w:jc w:val="both"/>
+      </w:pPr>
+      <w:r>
+        <w:t xml:space="preserve">Tout bascule le 19 mars 1944, lorsque l'Allemagne occupe la Hongrie, qui cherchait à se retirer de la guerre. Adolf Eichmann arrive avec une petite équipe de spécialistes de la déportation, qui s'appuie sur l'administration et la gendarmerie hongroises. Étoile jaune, ghettos, puis déportation à un rythme sans précédent : de la mi-mai au début de juillet 1944, environ 437 000 personnes sont envoyées vers Auschwitz-Birkenau, où la grande majorité est gazée dès l'arrivée. À Sighet, le ghetto est créé en avril et environ 13 000 Juifs sont déportés en quatre convois, du 16 au 22 mai 1944.</w:t>
       </w:r>
     </w:p>
     <w:p>
@@ -1306,7 +1478,7 @@
         <w:jc w:val="both"/>
       </w:pPr>
       <w:r>
-        <w:t xml:space="preserve">Le complexe d'Auschwitz, en Pologne annexée, réunit trois camps principaux : Auschwitz I, le camp souche ; Auschwitz II-Birkenau, centre de mise à mort où se fait la « sélection » sur la rampe ; Auschwitz III-Monowitz, lié à l'usine de caoutchouc synthétique, la </w:t>
+        <w:t xml:space="preserve">Le complexe d'Auschwitz, en Pologne annexée au Reich, réunit trois camps principaux : Auschwitz I, le camp souche ; Auschwitz II-Birkenau, centre de mise à mort où se fait la « sélection » sur la rampe ; Auschwitz III-Monowitz, lié à l'usine de caoutchouc synthétique, la </w:t>
       </w:r>
       <w:r>
         <w:rPr>
@@ -1326,7 +1498,7 @@
         <w:jc w:val="both"/>
       </w:pPr>
       <w:r>
-        <w:t xml:space="preserve">En janvier 1945, devant l'avancée de l'Armée rouge, les SS évacuent le complexe : près de 60 000 détenus partent à pied, dans la neige et le froid, vers Gleiwitz ou Loslau, avant d'être entassés dans des wagons découverts. Ce sont les « marches de la mort » que décrit Wiesel. Il échoue avec son père à Buchenwald, près de Weimar, où celui-ci meurt peu après. Le 11 avril 1945, alors que des détenus résistants ont pris le contrôle du camp, les troupes américaines y entrent et découvrent plus de 21 000 prisonniers.</w:t>
+        <w:t xml:space="preserve">En janvier 1945, devant l'avancée de l'Armée rouge, les SS évacuent le complexe : près de 60 000 détenus partent à pied, dans la neige et le froid, vers Gleiwitz ou Loslau, avant d'être entassés dans des wagons découverts. Des milliers meurent en route. Ce sont les « marches de la mort » que décrit Wiesel, avant le transfert à Buchenwald, près de Weimar. Le 11 avril 1945, alors que des détenus résistants ont pris le contrôle du camp, les troupes américaines y entrent et découvrent plus de 21 000 prisonniers, dont Eliezer.</w:t>
       </w:r>
     </w:p>
     <w:p>
@@ -1360,7 +1532,7 @@
         <w:t xml:space="preserve">Eliezer : </w:t>
       </w:r>
       <w:r>
-        <w:t xml:space="preserve">narrateur du récit et double à peine voilé de l'auteur, il a douze ans au début du livre, étudie le Talmud. La déportation le transforme : l'adolescent pieux devient un être qui se révolte contre Dieu, puis un corps réduit à la faim, attaché à la seule survie.</w:t>
+        <w:t xml:space="preserve">narrateur et double à peine voilé de l'auteur, il a douze ans au début du récit, étudie le Talmud et veut s'initier à la kabbale ; il en a quinze lors de la déportation. Le camp transforme l'adolescent pieux en révolté contre Dieu, puis en corps affamé, attaché à la survie.</w:t>
       </w:r>
     </w:p>
     <w:p>
@@ -1378,7 +1550,7 @@
         <w:t xml:space="preserve">Shlomo, le père : </w:t>
       </w:r>
       <w:r>
-        <w:t xml:space="preserve">commerçant respecté de Sighet, consulté par la communauté. Les rôles s'inversent : c'est le fils qui protège, nourrit et porte le père, tout en éprouvant la tentation de s'en libérer.</w:t>
+        <w:t xml:space="preserve">commerçant respecté de Sighet, il refuse de partir quand il en est encore temps. Épuisé par la dysenterie, frappé par un SS, Shlomo meurt à Buchenwald en janvier 1945 en appelant son fils, qui n'ose pas bouger.</w:t>
       </w:r>
     </w:p>
     <w:p>
@@ -1396,7 +1568,7 @@
         <w:t xml:space="preserve">La mère et Tzipora : </w:t>
       </w:r>
       <w:r>
-        <w:t xml:space="preserve">séparées des hommes dès l'arrivée à Birkenau, la mère et la petite sœur disparaissent dans la sélection. La fillette, qui tient la main de sa mère, incarne l'innocence anéantie dès le premier jour.</w:t>
+        <w:t xml:space="preserve">séparées des hommes dès l'arrivée à Birkenau, la mère et la petite sœur, qui lui tient la main, disparaissent pour toujours : l'innocence anéantie dès le premier jour.</w:t>
       </w:r>
     </w:p>
     <w:p>
@@ -1422,7 +1594,7 @@
         <w:t xml:space="preserve">Moshé le Bedeau : </w:t>
       </w:r>
       <w:r>
-        <w:t xml:space="preserve">maître d'Eliezer en kabbale, il est expulsé comme juif étranger, échappe à un massacre et revient avertir Sighet. Personne ne le croit : il est le prophète ignoré, figure de l'aveuglement collectif.</w:t>
+        <w:t xml:space="preserve">maître d'Eliezer en kabbale, expulsé comme juif étranger, il échappe à un massacre et revient avertir Sighet. C'est le prophète ignoré.</w:t>
       </w:r>
     </w:p>
     <w:p>
@@ -1440,7 +1612,7 @@
         <w:t xml:space="preserve">Madame Schächter : </w:t>
       </w:r>
       <w:r>
-        <w:t xml:space="preserve">dans le wagon, elle hurle qu'elle voit un feu ; on la bâillonne et on la frappe, jusqu'à ce que les flammes de Birkenau lui donnent raison. Elle est la Cassandre du récit.</w:t>
+        <w:t xml:space="preserve">dans le wagon, elle hurle qu'elle voit un feu ; on la bâillonne et la frappe, jusqu'à ce que les flammes de Birkenau lui donnent raison. C'est la Cassandre du récit.</w:t>
       </w:r>
     </w:p>
     <w:p>
@@ -1458,7 +1630,7 @@
         <w:t xml:space="preserve">Akiba Drumer : </w:t>
       </w:r>
       <w:r>
-        <w:t xml:space="preserve">pieux, doté d'une voix grave, il voit d'abord dans les souffrances une épreuve divine, puis perd la foi et se laisse sélectionner. Il demande qu'on dise pour lui le </w:t>
+        <w:t xml:space="preserve">pieux, à la voix grave, il voit d'abord dans les souffrances une épreuve divine, puis perd la foi et se laisse prendre à la sélection. Il demande qu'on dise pour lui le </w:t>
       </w:r>
       <w:r>
         <w:rPr>
@@ -1468,7 +1640,7 @@
         <w:t xml:space="preserve">Kaddish</w:t>
       </w:r>
       <w:r>
-        <w:t xml:space="preserve">, mais on l'oublie : sa fin montre que perdre la foi, c'est perdre la volonté de vivre.</w:t>
+        <w:t xml:space="preserve">, mais on l'oublie : perdre la foi, c'est perdre la volonté de vivre.</w:t>
       </w:r>
     </w:p>
     <w:p>
@@ -1486,7 +1658,7 @@
         <w:t xml:space="preserve">Rabbi Eliahou et son fils : </w:t>
       </w:r>
       <w:r>
-        <w:t xml:space="preserve">abandonné par son fils pendant la marche, le rabbin incarne la crainte qui hante Eliezer.</w:t>
+        <w:t xml:space="preserve">pendant la marche vers Gleiwitz, le fils distance volontairement son père.</w:t>
       </w:r>
     </w:p>
     <w:p>
@@ -1512,7 +1684,7 @@
         <w:t xml:space="preserve">Juliek : </w:t>
       </w:r>
       <w:r>
-        <w:t xml:space="preserve">le violoniste qui joue Beethoven au milieu des mourants de Gleiwitz incarne la dignité et l'art face à la barbarie.</w:t>
+        <w:t xml:space="preserve">le violoniste qui joue Beethoven dans la baraque de Gleiwitz est retrouvé mort au matin, son violon écrasé : la dignité de l'art face à la barbarie.</w:t>
       </w:r>
     </w:p>
     <w:p>
@@ -1530,7 +1702,7 @@
         <w:t xml:space="preserve">Meir Katz : </w:t>
       </w:r>
       <w:r>
-        <w:t xml:space="preserve">l'ami robuste qui sauve Eliezer dans le train finit par y mourir : même les plus forts cèdent.</w:t>
+        <w:t xml:space="preserve">ami robuste du père, il sauve Eliezer d'un étranglement dans le train, puis y meurt : même les plus forts cèdent.</w:t>
       </w:r>
     </w:p>
     <w:p>
@@ -1548,7 +1720,7 @@
         <w:t xml:space="preserve">Autres figures : </w:t>
       </w:r>
       <w:r>
-        <w:t xml:space="preserve">Yossi et Tibi, deux frères tchèques qui rêvent de Palestine, incarnent l'espoir fragile ; Stein d'Anvers, parent qu'Eliezer rassure par un mensonge, la pitié ; le pipel pendu à Buna, l'innocence assassinée ; le chef de bloc de Buchenwald, la loi du « chacun pour soi ».</w:t>
+        <w:t xml:space="preserve">Yossi et Tibi, frères tchèques qui rêvent de Palestine, l'espoir fragile ; Stein d'Anvers, qu'Eliezer rassure par un mensonge, la pitié ; la jeune Française qui le console, la solidarité ; le pipel pendu à Buna, l'innocence assassinée ; le chef de bloc de Buchenwald qui invite Eliezer à garder sa ration, la loi du « chacun pour soi ».</w:t>
       </w:r>
     </w:p>
     <w:p>
@@ -1574,7 +1746,7 @@
         <w:t xml:space="preserve">Le Dr Mengele : </w:t>
       </w:r>
       <w:r>
-        <w:t xml:space="preserve">il préside les sélections, incarnation de l'arbitraire froid qui décide de la vie et de la mort d'un geste.</w:t>
+        <w:t xml:space="preserve">il préside les sélections, décidant d'un geste froid de la vie et de la mort.</w:t>
       </w:r>
     </w:p>
     <w:p>
@@ -1599,7 +1771,7 @@
         <w:t xml:space="preserve">kapo</w:t>
       </w:r>
       <w:r>
-        <w:t xml:space="preserve"> sujet à des accès de folie, il frappe Eliezer et son père ; il montre la violence arbitraire déléguée aux détenus eux-mêmes.</w:t>
+        <w:t xml:space="preserve"> sujet à des accès de folie, il bat Eliezer et son père, puis fouette le garçon : la violence déléguée aux détenus eux-mêmes.</w:t>
       </w:r>
     </w:p>
     <w:p>
@@ -1617,7 +1789,7 @@
         <w:t xml:space="preserve">Franek : </w:t>
       </w:r>
       <w:r>
-        <w:t xml:space="preserve">contremaître polonais, ancien étudiant, il extorque la dent en or d'Eliezer en tourmentant son père.</w:t>
+        <w:t xml:space="preserve">contremaître polonais, ancien étudiant de Varsovie, il extorque la dent en or d'Eliezer en tourmentant son père.</w:t>
       </w:r>
     </w:p>
     <w:p>
@@ -1643,7 +1815,7 @@
         <w:jc w:val="both"/>
       </w:pPr>
       <w:r>
-        <w:t xml:space="preserve">Au début du récit, Eliezer est un adolescent pieux de Sighet qui étudie le Talmud et s'initie à la Kabbale auprès de Moshé le Bedeau. Le camp ne lui fait pas nier Dieu d'un coup : il lui fait douter de Sa justice. Comme Job, il ne conteste pas l'existence du Créateur mais Son silence face au mal. À Roch Hachana, tandis que des milliers de déportés prient et bénissent le nom de Dieu, il refuse de s'associer à la louange et retourne le procès : « J'étais l'accusateur », dit-il, Dieu devenant l'accusé. À Yom Kippour, il mange sa ration en signe de protestation. Le sommet de cette crise est la pendaison du pipel, un enfant à l'agonie interminable : à un déporté qui demande où est Dieu, une voix intérieure répond qu'Il est là, pendu au gibet. Mauriac y a lu la mort de Dieu dans l'âme d'un enfant ; on peut aussi y voir un Dieu qui souffre avec les victimes.</w:t>
+        <w:t xml:space="preserve">Le camp ne fait pas nier Dieu d'un coup à l'adolescent pieux de Sighet : il le fait douter de Sa justice. Sa révolte reste un dialogue avec Lui. À Roch Hachana, tandis que les déportés bénissent le nom de l'Éternel, il refuse de s'associer à la louange et inverse le procès : « J'étais l'accusateur », Dieu devenant l'accusé. À Yom Kippour, il mange sa ration en signe de protestation. Le sommet de cette crise est la pendaison du pipel, un enfant à l'agonie interminable : à un détenu qui demande où est Dieu, une voix intérieure répond qu'Il est là, pendu au gibet. On peut y lire la mort de Dieu dans une âme d'enfant, ou un Dieu qui souffre avec les victimes. Cette foi brisée se confond avec la perte de l'enfance : l'adolescent qui priait à la synagogue meurt dès la première nuit au camp.</w:t>
       </w:r>
     </w:p>
     <w:p>
@@ -1661,25 +1833,25 @@
         <w:jc w:val="both"/>
       </w:pPr>
       <w:r>
-        <w:t xml:space="preserve">Le lien avec son père devient la seule raison de survivre d'Eliezer, et les rôles s'inversent : le fils protège, nourrit et veille un père affaibli. Mais ce devoir est miné par la tentation de l'abandon. Wiesel construit des scènes en miroir : Rabbi Eliahou cherche son fils, qui l'a délaissé pendant la marche vers Gleiwitz, et Eliezer prie pour ne jamais agir ainsi ; dans le wagon vers Buchenwald, un fils frappe à mort son père pour un morceau de pain, avant d'être tué à son tour. Lorsque le père meurt, Eliezer ne parvient pas à pleurer et éprouve un soulagement coupable qui le hantera.</w:t>
-      </w:r>
-    </w:p>
-    <w:p>
-      <w:pPr>
-        <w:pStyle w:val="Heading3"/>
-      </w:pPr>
-      <w:r>
-        <w:t xml:space="preserve">La déshumanisation</w:t>
-      </w:r>
-    </w:p>
-    <w:p>
-      <w:pPr>
-        <w:spacing w:after="120"/>
-        <w:ind w:firstLine="340"/>
-        <w:jc w:val="both"/>
-      </w:pPr>
-      <w:r>
-        <w:t xml:space="preserve">Le système concentrationnaire efface l'individu. Le prénom devient un matricule tatoué, A-7713. La faim réduit l'existence à la soupe et au pain, au point que la nourriture compte davantage que la mort d'un proche. La morale elle-même se dissout : un chef de bloc conseille à Eliezer de garder pour lui la ration de son père, car au camp chacun vit et meurt pour soi seul. La dernière image condense ce processus : à la libération, Eliezer se regarde pour la première fois depuis le ghetto, et « un cadavre me contemplait ».</w:t>
+        <w:t xml:space="preserve">Le lien avec son père devient la principale raison de survivre d'Eliezer, et les rôles s'inversent : le fils protège, nourrit et veille un père affaibli. Ce devoir est miné par la tentation de l'abandon. Wiesel construit des scènes en miroir : Rabbi Eliahou cherche son fils, qui l'a délaissé pendant la marche vers Gleiwitz, et Eliezer prie pour ne jamais agir ainsi ; dans le wagon vers Buchenwald, un fils frappe à mort son père pour un morceau de pain, avant d'être tué à son tour. Lorsque le père meurt, Eliezer ne parvient pas à pleurer et éprouve un soulagement dont il a honte. De là naît une culpabilité du survivant qui imprègne le témoignage.</w:t>
+      </w:r>
+    </w:p>
+    <w:p>
+      <w:pPr>
+        <w:pStyle w:val="Heading3"/>
+      </w:pPr>
+      <w:r>
+        <w:t xml:space="preserve">La déshumanisation et l'instinct de survie</w:t>
+      </w:r>
+    </w:p>
+    <w:p>
+      <w:pPr>
+        <w:spacing w:after="120"/>
+        <w:ind w:firstLine="340"/>
+        <w:jc w:val="both"/>
+      </w:pPr>
+      <w:r>
+        <w:t xml:space="preserve">Le système concentrationnaire efface l'individu. Le prénom devient un matricule tatoué, A-7713. La faim réduit l'existence à la soupe et au pain : à la libération, les survivants ne pensent ni à se venger ni à leurs parents, seulement au pain. La morale elle-même se dissout : un chef de bloc conseille à Eliezer de garder pour lui la ration de son père, car au camp chacun vit et meurt pour soi, seul. L'instinct de conservation prend le dessus, lors des sélections comme pendant la course dans la neige, où s'arrêter signifie mourir. À la fin, Eliezer se regarde pour la première fois depuis le ghetto, et « un cadavre me contemplait ».</w:t>
       </w:r>
     </w:p>
     <w:p>
@@ -1697,7 +1869,7 @@
         <w:jc w:val="both"/>
       </w:pPr>
       <w:r>
-        <w:t xml:space="preserve">Le silence n'est pas seulement celui de Dieu. Il y a l'aveuglement des Juifs de Sighet, qui prennent Moshé pour un fou, puis le monde extérieur, qui laisse faire : les voisins regardent passer les convois, et des ouvriers allemands s'amusent à jeter du pain dans les wagons pour voir les déportés s'entretuer. Le titre de la première version, en yiddish, le disait déjà : le monde se taisait.</w:t>
+        <w:t xml:space="preserve">Le silence n'est pas seulement celui de Dieu. Il y a l'aveuglement des Juifs de Sighet, qui prennent Moshé pour un fou, puis le monde extérieur, qui laisse faire : des Allemands s'amusent à jeter du pain dans les wagons pour regarder les déportés s'entretuer. Le titre de la première version, en yiddish, le disait déjà : le monde se taisait.</w:t>
       </w:r>
     </w:p>
     <w:p>
@@ -1715,7 +1887,7 @@
         <w:jc w:val="both"/>
       </w:pPr>
       <w:r>
-        <w:t xml:space="preserve">De nuit arrivent les convois, de nuit surviennent les départs et les morts : la nuit est à la fois réelle et métaphysique, éclipse de Dieu et de toute lumière morale. Le feu, annoncé par Madame Schächter, devient réalité dans les fosses et les crématoires.</w:t>
+        <w:t xml:space="preserve">Départs, arrivées et morts surviennent de nuit : la nuit est à la fois réelle et métaphysique, éclipse de Dieu et de toute lumière morale. Le feu, annoncé dans le wagon par les cris de Madame Schächter, devient réalité à Birkenau, dans les fosses et les crématoires, et consume la foi du narrateur.</w:t>
       </w:r>
     </w:p>
     <w:p>
@@ -1741,7 +1913,7 @@
         <w:jc w:val="both"/>
       </w:pPr>
       <w:r>
-        <w:t xml:space="preserve">Libéré de Buchenwald en avril 1945, Elie Wiesel s'impose un vœu de silence de dix ans avant de témoigner. Vers 1954, il rédige en yiddish un long récit de plus de huit cents pages manuscrites, publié en 1956 à Buenos Aires sous le titre </w:t>
+        <w:t xml:space="preserve">Après la libération, Elie Wiesel s'impose, selon son propre récit, dix ans de silence. En 1954, il achève en yiddish un manuscrit de plus de huit cents pages, réduit à 245 pages pour sa publication à Buenos Aires en 1956 sous le titre </w:t>
       </w:r>
       <w:r>
         <w:rPr>
@@ -1751,7 +1923,7 @@
         <w:t xml:space="preserve">Un di velt hot geshvign</w:t>
       </w:r>
       <w:r>
-        <w:t xml:space="preserve"> (« Et le monde se taisait »), ramené à environ 245 pages imprimées. Le tournant vient de la rencontre, au milieu des années 1950, avec François Mauriac, que le jeune journaliste vient interviewer. Mauriac, hanté par les trains d'enfants juifs que sa femme avait vus partir de la gare d'Austerlitz, apprend que Wiesel était l'un de ces enfants ; il l'encourage à écrire et l'aide à trouver un éditeur. Le texte, profondément remanié et resserré, paraît aux Éditions de Minuit en 1958 sous le titre </w:t>
+        <w:t xml:space="preserve"> (« Et le monde se taisait »). Le tournant est la rencontre, vers 1954-1955, avec François Mauriac, que le jeune journaliste vient interviewer. Mauriac évoque les trains d'enfants juifs que sa femme avait vus à la gare d'Austerlitz ; Wiesel lui répond qu'il était l'un d'eux. L'écrivain l'encourage à parler et l'aide à trouver un éditeur. Réécrit et considérablement resserré, le texte paraît aux Éditions de Minuit en 1958 sous le titre </w:t>
       </w:r>
       <w:r>
         <w:rPr>
@@ -1761,7 +1933,7 @@
         <w:t xml:space="preserve">La Nuit</w:t>
       </w:r>
       <w:r>
-        <w:t xml:space="preserve">, avec une préface où Mauriac raconte cette rencontre et voit dans son interlocuteur un enfant juif revenu de l'abîme. La traduction anglaise, </w:t>
+        <w:t xml:space="preserve"> : environ 180 pages seulement, précédées d'une préface où Mauriac raconte cette rencontre. La traduction anglaise, </w:t>
       </w:r>
       <w:r>
         <w:rPr>
@@ -1771,7 +1943,7 @@
         <w:t xml:space="preserve">Night</w:t>
       </w:r>
       <w:r>
-        <w:t xml:space="preserve">, paraît en 1960 ; Marion Wiesel en signe une nouvelle en 2006.</w:t>
+        <w:t xml:space="preserve">, paraît en 1960 ; Marion Wiesel, épouse de l'auteur, en signe une nouvelle en 2006.</w:t>
       </w:r>
     </w:p>
     <w:p>
@@ -1796,7 +1968,17 @@
         <w:t xml:space="preserve">La Nuit</w:t>
       </w:r>
       <w:r>
-        <w:t xml:space="preserve"> est d'abord un témoignage. Pourtant, le narrateur s'appelle Eliezer, et l'œuvre a parfois été classée parmi les romans, notamment aux États-Unis. La critique a relevé l'écart entre la version yiddish, plus vindicative, et la version française, plus méditative. Wiesel, lui, a toujours parlé de témoignage. On le lit aujourd'hui comme un récit autobiographique de témoignage, situé entre mémoires et littérature.</w:t>
+        <w:t xml:space="preserve"> est d'abord un témoignage : le narrateur, Eliezer, porte le prénom hébraïque de l'auteur. L'œuvre a pourtant parfois été rangée parmi les romans, notamment aux États-Unis, car elle sélectionne, compose et met en forme. La comparaison des deux versions éclaire ce travail : la critique, à la suite de Naomi Seidman, a montré que le texte yiddish est plus accusateur, tandis que la version française privilégie la crise de la foi et l'interrogation sur le silence de Dieu. Wiesel a toujours revendiqué le terme de témoignage ; on lit aujourd'hui </w:t>
+      </w:r>
+      <w:r>
+        <w:rPr>
+          <w:i/>
+          <w:iCs/>
+        </w:rPr>
+        <w:t xml:space="preserve">La Nuit</w:t>
+      </w:r>
+      <w:r>
+        <w:t xml:space="preserve"> comme un récit autobiographique situé entre mémoires et littérature.</w:t>
       </w:r>
     </w:p>
     <w:p>
@@ -1814,7 +1996,7 @@
         <w:jc w:val="both"/>
       </w:pPr>
       <w:r>
-        <w:t xml:space="preserve">Le style frappe par sa sobriété. Les phrases sont brèves, souvent juxtaposées, le vocabulaire simple, les commentaires rares. Wiesel procède par ellipses : il laisse les silences dire ce que les mots ne peuvent exprimer. L'ironie tragique traverse le récit, de l'aveuglement des Juifs de Sighet aux espoirs déçus, et deux images, la nuit et le feu, le structurent. Ce dépouillement est voulu : Wiesel a choisi la retenue plutôt que l'accumulation.</w:t>
+        <w:t xml:space="preserve">Le style frappe par sa sobriété : phrases brèves, souvent juxtaposées, vocabulaire simple, commentaires rares. Wiesel procède par ellipses et laisse les silences dire ce que les mots ne peuvent exprimer. Lorsque l'émotion affleure, elle passe par des formes nettes, comme l'anaphore « Jamais je n'oublierai » qui scande la première nuit au camp, ou l'image finale du cadavre qui le contemple dans le miroir.</w:t>
       </w:r>
     </w:p>
     <w:p>
@@ -1832,7 +2014,101 @@
         <w:jc w:val="both"/>
       </w:pPr>
       <w:r>
-        <w:t xml:space="preserve">Le succès ne fut pas immédiat : les premières éditions se vendirent modestement et plusieurs éditeurs américains refusèrent d'abord le manuscrit. Traduit dans plus de trente langues, il s'est vendu à environ dix millions d'exemplaires et figure dans les programmes scolaires de nombreux pays. En janvier 2006, Oprah Winfrey le choisit pour son club de lecture, ce qui le hisse en tête des ventes aux États-Unis. </w:t>
+        <w:t xml:space="preserve">Le succès ne fut pas immédiat : les premières éditions se vendirent modestement, et plusieurs éditeurs américains refusèrent d'abord le texte. Traduit dans une trentaine de langues, vendu à plusieurs millions d'exemplaires, le livre figure dans les programmes scolaires de nombreux pays. En 2006, le club de lecture d'Oprah Winfrey le hisse en tête des ventes aux États-Unis. Wiesel l'a enfin associé à deux récits de fiction, </w:t>
+      </w:r>
+      <w:r>
+        <w:rPr>
+          <w:i/>
+          <w:iCs/>
+        </w:rPr>
+        <w:t xml:space="preserve">L'Aube</w:t>
+      </w:r>
+      <w:r>
+        <w:t xml:space="preserve"> (1960) et </w:t>
+      </w:r>
+      <w:r>
+        <w:rPr>
+          <w:i/>
+          <w:iCs/>
+        </w:rPr>
+        <w:t xml:space="preserve">Le Jour</w:t>
+      </w:r>
+      <w:r>
+        <w:t xml:space="preserve"> (1961), qui prolongent la réflexion sur la survie, la culpabilité et le sens après Auschwitz.</w:t>
+      </w:r>
+    </w:p>
+    <w:p>
+      <w:pPr>
+        <w:pStyle w:val="Heading2"/>
+      </w:pPr>
+      <w:r>
+        <w:t xml:space="preserve">Passages clés et portée de l'œuvre</w:t>
+      </w:r>
+    </w:p>
+    <w:p>
+      <w:pPr>
+        <w:pStyle w:val="Heading3"/>
+      </w:pPr>
+      <w:r>
+        <w:t xml:space="preserve">Cinq passages clés</w:t>
+      </w:r>
+    </w:p>
+    <w:p>
+      <w:pPr>
+        <w:spacing w:after="120"/>
+        <w:ind w:firstLine="340"/>
+        <w:jc w:val="both"/>
+      </w:pPr>
+      <w:r>
+        <w:t xml:space="preserve">« Jamais je n'oublierai cette nuit, la première nuit de camp » (chapitre 3). Cette litanie fonctionne comme un serment. Elle retourne la prière : au lieu de louer Dieu, elle énumère ce qui a tué la foi et l'enfance, les flammes, la fumée, les visages des enfants.</w:t>
+      </w:r>
+    </w:p>
+    <w:p>
+      <w:pPr>
+        <w:spacing w:after="120"/>
+        <w:ind w:firstLine="340"/>
+        <w:jc w:val="both"/>
+      </w:pPr>
+      <w:r>
+        <w:t xml:space="preserve">« Où est le bon Dieu, où est-il ? » (chapitre 4). Devant le pipel qui agonise, un détenu pose la question ; une voix intérieure répond en Eliezer que Dieu est là, pendu à cette potence. La mort d'un enfant innocent devient la mort de Dieu dans le cœur du témoin.</w:t>
+      </w:r>
+    </w:p>
+    <w:p>
+      <w:pPr>
+        <w:spacing w:after="120"/>
+        <w:ind w:firstLine="340"/>
+        <w:jc w:val="both"/>
+      </w:pPr>
+      <w:r>
+        <w:t xml:space="preserve">« J'étais l'accusateur. Et l'accusé : Dieu » (chapitre 5). À Roch Hachana, Eliezer renverse le rapport entre le croyant et Dieu : c'est l'homme qui juge. Mais on n'accuse que celui dont on attend encore quelque chose.</w:t>
+      </w:r>
+    </w:p>
+    <w:p>
+      <w:pPr>
+        <w:spacing w:after="120"/>
+        <w:ind w:firstLine="340"/>
+        <w:jc w:val="both"/>
+      </w:pPr>
+      <w:r>
+        <w:t xml:space="preserve">« Son dernier mot avait été mon nom » (chapitre 8). Le père meurt à Buchenwald en appelant « Eliezer », sans que son fils, paralysé par la peur des coups, lui réponde. Eliezer devine même en lui un obscur soulagement d'être enfin libre, d'où la culpabilité qui hante le survivant.</w:t>
+      </w:r>
+    </w:p>
+    <w:p>
+      <w:pPr>
+        <w:spacing w:after="120"/>
+        <w:ind w:firstLine="340"/>
+        <w:jc w:val="both"/>
+      </w:pPr>
+      <w:r>
+        <w:t xml:space="preserve">« Du fond du miroir, un cadavre me contemplait » (chapitre 9). Après la libération, Eliezer se regarde pour la première fois depuis le ghetto. Le récit s'achève ainsi non sur une délivrance, mais sur un regard qui « ne me quitte plus ».</w:t>
+      </w:r>
+    </w:p>
+    <w:p>
+      <w:pPr>
+        <w:pStyle w:val="Heading3"/>
+      </w:pPr>
+      <w:r>
+        <w:t xml:space="preserve">Pourquoi lire </w:t>
       </w:r>
       <w:r>
         <w:rPr>
@@ -1842,101 +2118,17 @@
         <w:t xml:space="preserve">La Nuit</w:t>
       </w:r>
       <w:r>
-        <w:t xml:space="preserve"> ouvre enfin un triptyque complété par deux récits de fiction, </w:t>
-      </w:r>
-      <w:r>
-        <w:rPr>
-          <w:i/>
-          <w:iCs/>
-        </w:rPr>
-        <w:t xml:space="preserve">L'Aube</w:t>
-      </w:r>
-      <w:r>
-        <w:t xml:space="preserve"> (1960) et </w:t>
-      </w:r>
-      <w:r>
-        <w:rPr>
-          <w:i/>
-          <w:iCs/>
-        </w:rPr>
-        <w:t xml:space="preserve">Le Jour</w:t>
-      </w:r>
-      <w:r>
-        <w:t xml:space="preserve"> (1961), qui prolongent la réflexion sur la survie, la culpabilité et le sens après Auschwitz.</w:t>
-      </w:r>
-    </w:p>
-    <w:p>
-      <w:pPr>
-        <w:pStyle w:val="Heading2"/>
-      </w:pPr>
-      <w:r>
-        <w:t xml:space="preserve">Passages clés et portée de l'œuvre</w:t>
-      </w:r>
-    </w:p>
-    <w:p>
-      <w:pPr>
-        <w:pStyle w:val="Heading3"/>
-      </w:pPr>
-      <w:r>
-        <w:t xml:space="preserve">Cinq passages clés</w:t>
-      </w:r>
-    </w:p>
-    <w:p>
-      <w:pPr>
-        <w:spacing w:after="120"/>
-        <w:ind w:firstLine="340"/>
-        <w:jc w:val="both"/>
-      </w:pPr>
-      <w:r>
-        <w:t xml:space="preserve">« Jamais je n'oublierai cette nuit, la première nuit de camp » (chapitre 3). Cette litanie, construite sur l'anaphore « Jamais je n'oublierai », fonctionne comme un serment. Elle retourne la prière : au lieu de louer Dieu, elle énumère ce qui a tué la foi et l'enfance.</w:t>
-      </w:r>
-    </w:p>
-    <w:p>
-      <w:pPr>
-        <w:spacing w:after="120"/>
-        <w:ind w:firstLine="340"/>
-        <w:jc w:val="both"/>
-      </w:pPr>
-      <w:r>
-        <w:t xml:space="preserve">« Où est le bon Dieu, où est-il ? » (chapitre 4). Devant le pipel qui agonise, une voix intérieure répond à Eliezer que Dieu est là, pendu à cette potence. La scène condense la crise religieuse du récit : la mort d'un enfant innocent devient la mort de Dieu dans le cœur du témoin.</w:t>
-      </w:r>
-    </w:p>
-    <w:p>
-      <w:pPr>
-        <w:spacing w:after="120"/>
-        <w:ind w:firstLine="340"/>
-        <w:jc w:val="both"/>
-      </w:pPr>
-      <w:r>
-        <w:t xml:space="preserve">« J'étais l'accusateur. Et l'accusé : Dieu » (chapitre 5). Le jour de Roch Hachana, pendant que des milliers de déportés prient, Eliezer refuse de bénir le nom de l'Éternel. Il renverse le rapport traditionnel entre le croyant et Dieu : c'est désormais l'homme qui juge. Mais on n'accuse que celui dont on attend encore quelque chose.</w:t>
-      </w:r>
-    </w:p>
-    <w:p>
-      <w:pPr>
-        <w:spacing w:after="120"/>
-        <w:ind w:firstLine="340"/>
-        <w:jc w:val="both"/>
-      </w:pPr>
-      <w:r>
-        <w:t xml:space="preserve">« Son dernier mot avait été mon nom » (chapitre 8). Le père meurt à Buchenwald en appelant « Eliezer », sans que son fils, épuisé, ose lui répondre sous les coups. D'où la culpabilité qui hante le survivant.</w:t>
-      </w:r>
-    </w:p>
-    <w:p>
-      <w:pPr>
-        <w:spacing w:after="120"/>
-        <w:ind w:firstLine="340"/>
-        <w:jc w:val="both"/>
-      </w:pPr>
-      <w:r>
-        <w:t xml:space="preserve">« Du fond du miroir, un cadavre me contemplait » (chapitre 9). Après la libération, Eliezer se regarde pour la première fois depuis le ghetto. On peut survivre au camp sans en sortir vraiment vivant. Le récit s'achève ainsi non sur une délivrance, mais sur un regard qui « ne me quitte plus ».</w:t>
-      </w:r>
-    </w:p>
-    <w:p>
-      <w:pPr>
-        <w:pStyle w:val="Heading3"/>
-      </w:pPr>
-      <w:r>
-        <w:t xml:space="preserve">Pourquoi lire </w:t>
+        <w:t xml:space="preserve"> aujourd'hui</w:t>
+      </w:r>
+    </w:p>
+    <w:p>
+      <w:pPr>
+        <w:spacing w:after="120"/>
+        <w:ind w:firstLine="340"/>
+        <w:jc w:val="both"/>
+      </w:pPr>
+      <w:r>
+        <w:t xml:space="preserve">Par sa sobriété, </w:t>
       </w:r>
       <w:r>
         <w:rPr>
@@ -1946,17 +2138,7 @@
         <w:t xml:space="preserve">La Nuit</w:t>
       </w:r>
       <w:r>
-        <w:t xml:space="preserve"> aujourd'hui</w:t>
-      </w:r>
-    </w:p>
-    <w:p>
-      <w:pPr>
-        <w:spacing w:after="120"/>
-        <w:ind w:firstLine="340"/>
-        <w:jc w:val="both"/>
-      </w:pPr>
-      <w:r>
-        <w:t xml:space="preserve">Par sa sobriété, </w:t>
+        <w:t xml:space="preserve"> donne un visage aux chiffres de la Shoah et reste, alors que les derniers rescapés disparaissent, un rempart contre l'oubli et le négationnisme. Le livre pose surtout la question de l'indifférence. Dans son discours de réception du prix Nobel de la paix, prononcé à Oslo le 10 décembre 1986, Elie Wiesel affirme qu'il faut toujours prendre parti, car « la neutralité aide l'oppresseur, jamais la victime » et « le silence encourage le bourreau, jamais le supplicié ». Il le résumait souvent ainsi : le contraire de l'amour n'est pas la haine, mais l'indifférence. Lire </w:t>
       </w:r>
       <w:r>
         <w:rPr>
@@ -1966,37 +2148,7 @@
         <w:t xml:space="preserve">La Nuit</w:t>
       </w:r>
       <w:r>
-        <w:t xml:space="preserve"> donne un visage aux chiffres de la Shoah et reste, alors que les derniers rescapés disparaissent, un rempart contre l'oubli et le négationnisme. Il pose surtout la question de l'indifférence. Dans son discours de réception du prix Nobel de la paix, prononcé à Oslo le 10 décembre 1986, Elie Wiesel affirme qu'il faut toujours prendre parti, car « la neutralité aide l'oppresseur, jamais la victime » et « le silence encourage le bourreau, jamais le supplicié ». La même année, dans un entretien accordé au magazine américain </w:t>
-      </w:r>
-      <w:r>
-        <w:rPr>
-          <w:i/>
-          <w:iCs/>
-        </w:rPr>
-        <w:t xml:space="preserve">U.S. News &amp; World Report</w:t>
-      </w:r>
-      <w:r>
-        <w:t xml:space="preserve">, il résumait sa pensée par une formule devenue célèbre : le contraire de l'amour n'est pas la haine, mais l'indifférence.</w:t>
-      </w:r>
-    </w:p>
-    <w:p>
-      <w:pPr>
-        <w:spacing w:after="120"/>
-        <w:ind w:firstLine="340"/>
-        <w:jc w:val="both"/>
-      </w:pPr>
-      <w:r>
-        <w:t xml:space="preserve">Lire </w:t>
-      </w:r>
-      <w:r>
-        <w:rPr>
-          <w:i/>
-          <w:iCs/>
-        </w:rPr>
-        <w:t xml:space="preserve">La Nuit</w:t>
-      </w:r>
-      <w:r>
-        <w:t xml:space="preserve"> aujourd'hui, c'est devenir à son tour témoin du témoin, et se demander ce que l'on ferait soi-même face à l'injustice. Reste une interrogation ouverte : la mémoire suffit-elle à empêcher que l'histoire se répète, ou ne prend-elle tout son sens que lorsqu'elle se transforme en action ?</w:t>
+        <w:t xml:space="preserve">, c'est devenir à son tour témoin du témoin. Reste une question ouverte : la mémoire suffit-elle à empêcher que l'histoire se répète, si elle ne se transforme pas en action ?</w:t>
       </w:r>
     </w:p>
     <w:sectPr>

</xml_diff>